<commit_message>
Docs + features: PlantUML diagrams + export script; drone delete endpoints + admin UI; user password update fix; legacy routes preserved; payment/delivery stabilizations; README updates
</commit_message>
<xml_diff>
--- a/Docucment_PRD/PRD_FoodFastDelivery.docx
+++ b/Docucment_PRD/PRD_FoodFastDelivery.docx
@@ -5397,58 +5397,48 @@
         <w:spacing w:line="360" w:lineRule="auto"/>
         <w:rPr>
           <w:rFonts w:ascii="Times New Roman" w:hAnsi="Times New Roman" w:cs="Times New Roman"/>
-        </w:rPr>
-      </w:pPr>
-      <w:r>
-        <w:rPr>
-          <w:rFonts w:ascii="Times New Roman" w:hAnsi="Times New Roman" w:cs="Times New Roman"/>
           <w:b/>
           <w:bCs/>
           <w:sz w:val="28"/>
           <w:szCs w:val="28"/>
         </w:rPr>
+      </w:pPr>
+      <w:r>
+        <w:rPr>
+          <w:rFonts w:ascii="Times New Roman" w:hAnsi="Times New Roman" w:cs="Times New Roman"/>
+          <w:b/>
+          <w:bCs/>
+          <w:sz w:val="28"/>
+          <w:szCs w:val="28"/>
+        </w:rPr>
         <w:lastRenderedPageBreak/>
-        <w:t>Key Flows</w:t>
+        <w:t>Use-case</w:t>
       </w:r>
     </w:p>
     <w:p>
       <w:pPr>
-        <w:pStyle w:val="ListParagraph"/>
-        <w:numPr>
-          <w:ilvl w:val="0"/>
-          <w:numId w:val="5"/>
-        </w:numPr>
         <w:spacing w:line="360" w:lineRule="auto"/>
         <w:rPr>
           <w:rFonts w:ascii="Times New Roman" w:hAnsi="Times New Roman" w:cs="Times New Roman"/>
-        </w:rPr>
-      </w:pPr>
-      <w:r>
-        <w:rPr>
-          <w:rFonts w:ascii="Times New Roman" w:hAnsi="Times New Roman" w:cs="Times New Roman"/>
-        </w:rPr>
-        <w:t>P</w:t>
-      </w:r>
-      <w:r>
-        <w:rPr>
-          <w:rFonts w:ascii="Times New Roman" w:hAnsi="Times New Roman" w:cs="Times New Roman"/>
-        </w:rPr>
-        <w:t>rocessing flow</w:t>
-      </w:r>
-    </w:p>
-    <w:p>
-      <w:pPr>
-        <w:pStyle w:val="NormalWeb"/>
-      </w:pPr>
-      <w:r>
-        <w:rPr>
-          <w:noProof/>
+          <w:b/>
+          <w:bCs/>
+          <w:sz w:val="28"/>
+          <w:szCs w:val="28"/>
+        </w:rPr>
+      </w:pPr>
+      <w:r>
+        <w:rPr>
+          <w:rFonts w:ascii="Times New Roman" w:hAnsi="Times New Roman" w:cs="Times New Roman"/>
+          <w:b/>
+          <w:bCs/>
+          <w:sz w:val="28"/>
+          <w:szCs w:val="28"/>
         </w:rPr>
         <w:drawing>
-          <wp:inline distT="0" distB="0" distL="0" distR="0" wp14:anchorId="0F0DAA8F" wp14:editId="70387913">
-            <wp:extent cx="6470548" cy="7370618"/>
-            <wp:effectExtent l="0" t="0" r="6985" b="1905"/>
-            <wp:docPr id="139010528" name="Picture 1" descr="A close-up of a document&#10;&#10;AI-generated content may be incorrect."/>
+          <wp:inline distT="0" distB="0" distL="0" distR="0" wp14:anchorId="1CF58628" wp14:editId="5261EA80">
+            <wp:extent cx="6680300" cy="5090160"/>
+            <wp:effectExtent l="0" t="0" r="6350" b="0"/>
+            <wp:docPr id="1791653642" name="Picture 2" descr="A diagram of a chat&#10;&#10;AI-generated content may be incorrect."/>
             <wp:cNvGraphicFramePr>
               <a:graphicFrameLocks xmlns:a="http://schemas.openxmlformats.org/drawingml/2006/main" noChangeAspect="1"/>
             </wp:cNvGraphicFramePr>
@@ -5456,13 +5446,13 @@
               <a:graphicData uri="http://schemas.openxmlformats.org/drawingml/2006/picture">
                 <pic:pic xmlns:pic="http://schemas.openxmlformats.org/drawingml/2006/picture">
                   <pic:nvPicPr>
-                    <pic:cNvPr id="139010528" name="Picture 1" descr="A close-up of a document&#10;&#10;AI-generated content may be incorrect."/>
+                    <pic:cNvPr id="1791653642" name="Picture 2" descr="A diagram of a chat&#10;&#10;AI-generated content may be incorrect."/>
                     <pic:cNvPicPr>
                       <a:picLocks noChangeAspect="1" noChangeArrowheads="1"/>
                     </pic:cNvPicPr>
                   </pic:nvPicPr>
                   <pic:blipFill>
-                    <a:blip r:embed="rId6" cstate="print">
+                    <a:blip r:embed="rId6">
                       <a:extLst>
                         <a:ext uri="{28A0092B-C50C-407E-A947-70E740481C1C}">
                           <a14:useLocalDpi xmlns:a14="http://schemas.microsoft.com/office/drawing/2010/main" val="0"/>
@@ -5477,7 +5467,7 @@
                   <pic:spPr bwMode="auto">
                     <a:xfrm>
                       <a:off x="0" y="0"/>
-                      <a:ext cx="6488976" cy="7391609"/>
+                      <a:ext cx="6685971" cy="5094481"/>
                     </a:xfrm>
                     <a:prstGeom prst="rect">
                       <a:avLst/>
@@ -5505,7 +5495,10 @@
           <w:szCs w:val="28"/>
         </w:rPr>
       </w:pPr>
-      <w:r>
+    </w:p>
+    <w:p>
+      <w:pPr>
+        <w:spacing w:line="360" w:lineRule="auto"/>
         <w:rPr>
           <w:rFonts w:ascii="Times New Roman" w:hAnsi="Times New Roman" w:cs="Times New Roman"/>
           <w:b/>
@@ -5513,7 +5506,798 @@
           <w:sz w:val="28"/>
           <w:szCs w:val="28"/>
         </w:rPr>
+      </w:pPr>
+    </w:p>
+    <w:p>
+      <w:pPr>
+        <w:spacing w:line="360" w:lineRule="auto"/>
+        <w:rPr>
+          <w:rFonts w:ascii="Times New Roman" w:hAnsi="Times New Roman" w:cs="Times New Roman"/>
+          <w:b/>
+          <w:bCs/>
+          <w:sz w:val="28"/>
+          <w:szCs w:val="28"/>
+        </w:rPr>
+      </w:pPr>
+    </w:p>
+    <w:p>
+      <w:pPr>
+        <w:spacing w:line="360" w:lineRule="auto"/>
+        <w:rPr>
+          <w:rFonts w:ascii="Times New Roman" w:hAnsi="Times New Roman" w:cs="Times New Roman"/>
+          <w:b/>
+          <w:bCs/>
+          <w:sz w:val="28"/>
+          <w:szCs w:val="28"/>
+        </w:rPr>
+      </w:pPr>
+    </w:p>
+    <w:p>
+      <w:pPr>
+        <w:spacing w:line="360" w:lineRule="auto"/>
+        <w:rPr>
+          <w:rFonts w:ascii="Times New Roman" w:hAnsi="Times New Roman" w:cs="Times New Roman"/>
+          <w:b/>
+          <w:bCs/>
+          <w:sz w:val="28"/>
+          <w:szCs w:val="28"/>
+        </w:rPr>
+      </w:pPr>
+    </w:p>
+    <w:p>
+      <w:pPr>
+        <w:spacing w:line="360" w:lineRule="auto"/>
+        <w:rPr>
+          <w:rFonts w:ascii="Times New Roman" w:hAnsi="Times New Roman" w:cs="Times New Roman"/>
+          <w:b/>
+          <w:bCs/>
+          <w:sz w:val="28"/>
+          <w:szCs w:val="28"/>
+        </w:rPr>
+      </w:pPr>
+    </w:p>
+    <w:p>
+      <w:pPr>
+        <w:spacing w:line="360" w:lineRule="auto"/>
+        <w:rPr>
+          <w:rFonts w:ascii="Times New Roman" w:hAnsi="Times New Roman" w:cs="Times New Roman"/>
+        </w:rPr>
+      </w:pPr>
+      <w:r>
+        <w:rPr>
+          <w:rFonts w:ascii="Times New Roman" w:hAnsi="Times New Roman" w:cs="Times New Roman"/>
+          <w:b/>
+          <w:bCs/>
+          <w:sz w:val="28"/>
+          <w:szCs w:val="28"/>
+        </w:rPr>
         <w:lastRenderedPageBreak/>
+        <w:t>Key Flows</w:t>
+      </w:r>
+    </w:p>
+    <w:p>
+      <w:pPr>
+        <w:pStyle w:val="ListParagraph"/>
+        <w:numPr>
+          <w:ilvl w:val="0"/>
+          <w:numId w:val="5"/>
+        </w:numPr>
+        <w:spacing w:line="360" w:lineRule="auto"/>
+        <w:rPr>
+          <w:rFonts w:ascii="Times New Roman" w:hAnsi="Times New Roman" w:cs="Times New Roman"/>
+        </w:rPr>
+      </w:pPr>
+      <w:r>
+        <w:rPr>
+          <w:rFonts w:ascii="Times New Roman" w:hAnsi="Times New Roman" w:cs="Times New Roman"/>
+        </w:rPr>
+        <w:t>Activity</w:t>
+      </w:r>
+    </w:p>
+    <w:p>
+      <w:pPr>
+        <w:pStyle w:val="ListParagraph"/>
+        <w:numPr>
+          <w:ilvl w:val="1"/>
+          <w:numId w:val="5"/>
+        </w:numPr>
+        <w:spacing w:line="360" w:lineRule="auto"/>
+        <w:rPr>
+          <w:rFonts w:ascii="Times New Roman" w:hAnsi="Times New Roman" w:cs="Times New Roman"/>
+        </w:rPr>
+      </w:pPr>
+      <w:proofErr w:type="spellStart"/>
+      <w:r>
+        <w:rPr>
+          <w:rFonts w:ascii="Times New Roman" w:hAnsi="Times New Roman" w:cs="Times New Roman"/>
+        </w:rPr>
+        <w:t>Đặt</w:t>
+      </w:r>
+      <w:proofErr w:type="spellEnd"/>
+      <w:r>
+        <w:rPr>
+          <w:rFonts w:ascii="Times New Roman" w:hAnsi="Times New Roman" w:cs="Times New Roman"/>
+        </w:rPr>
+        <w:t xml:space="preserve"> </w:t>
+      </w:r>
+      <w:proofErr w:type="spellStart"/>
+      <w:r>
+        <w:rPr>
+          <w:rFonts w:ascii="Times New Roman" w:hAnsi="Times New Roman" w:cs="Times New Roman"/>
+        </w:rPr>
+        <w:t>hàng</w:t>
+      </w:r>
+      <w:proofErr w:type="spellEnd"/>
+    </w:p>
+    <w:p>
+      <w:pPr>
+        <w:pStyle w:val="NormalWeb"/>
+        <w:ind w:left="720"/>
+      </w:pPr>
+      <w:r>
+        <w:rPr>
+          <w:noProof/>
+        </w:rPr>
+        <w:drawing>
+          <wp:inline distT="0" distB="0" distL="0" distR="0" wp14:anchorId="28492169" wp14:editId="64870F70">
+            <wp:extent cx="5943600" cy="5069205"/>
+            <wp:effectExtent l="0" t="0" r="0" b="0"/>
+            <wp:docPr id="1285315016" name="Picture 8" descr="A screenshot of a diagram&#10;&#10;AI-generated content may be incorrect."/>
+            <wp:cNvGraphicFramePr>
+              <a:graphicFrameLocks xmlns:a="http://schemas.openxmlformats.org/drawingml/2006/main" noChangeAspect="1"/>
+            </wp:cNvGraphicFramePr>
+            <a:graphic xmlns:a="http://schemas.openxmlformats.org/drawingml/2006/main">
+              <a:graphicData uri="http://schemas.openxmlformats.org/drawingml/2006/picture">
+                <pic:pic xmlns:pic="http://schemas.openxmlformats.org/drawingml/2006/picture">
+                  <pic:nvPicPr>
+                    <pic:cNvPr id="1285315016" name="Picture 8" descr="A screenshot of a diagram&#10;&#10;AI-generated content may be incorrect."/>
+                    <pic:cNvPicPr>
+                      <a:picLocks noChangeAspect="1" noChangeArrowheads="1"/>
+                    </pic:cNvPicPr>
+                  </pic:nvPicPr>
+                  <pic:blipFill>
+                    <a:blip r:embed="rId7">
+                      <a:extLst>
+                        <a:ext uri="{28A0092B-C50C-407E-A947-70E740481C1C}">
+                          <a14:useLocalDpi xmlns:a14="http://schemas.microsoft.com/office/drawing/2010/main" val="0"/>
+                        </a:ext>
+                      </a:extLst>
+                    </a:blip>
+                    <a:srcRect/>
+                    <a:stretch>
+                      <a:fillRect/>
+                    </a:stretch>
+                  </pic:blipFill>
+                  <pic:spPr bwMode="auto">
+                    <a:xfrm>
+                      <a:off x="0" y="0"/>
+                      <a:ext cx="5943600" cy="5069205"/>
+                    </a:xfrm>
+                    <a:prstGeom prst="rect">
+                      <a:avLst/>
+                    </a:prstGeom>
+                    <a:noFill/>
+                    <a:ln>
+                      <a:noFill/>
+                    </a:ln>
+                  </pic:spPr>
+                </pic:pic>
+              </a:graphicData>
+            </a:graphic>
+          </wp:inline>
+        </w:drawing>
+      </w:r>
+    </w:p>
+    <w:p>
+      <w:pPr>
+        <w:pStyle w:val="ListParagraph"/>
+        <w:spacing w:line="360" w:lineRule="auto"/>
+        <w:ind w:left="1440"/>
+        <w:rPr>
+          <w:rFonts w:ascii="Times New Roman" w:hAnsi="Times New Roman" w:cs="Times New Roman"/>
+        </w:rPr>
+      </w:pPr>
+    </w:p>
+    <w:p>
+      <w:pPr>
+        <w:pStyle w:val="ListParagraph"/>
+        <w:spacing w:line="360" w:lineRule="auto"/>
+        <w:ind w:left="1440"/>
+        <w:rPr>
+          <w:rFonts w:ascii="Times New Roman" w:hAnsi="Times New Roman" w:cs="Times New Roman"/>
+        </w:rPr>
+      </w:pPr>
+    </w:p>
+    <w:p>
+      <w:pPr>
+        <w:pStyle w:val="ListParagraph"/>
+        <w:spacing w:line="360" w:lineRule="auto"/>
+        <w:ind w:left="1440"/>
+        <w:rPr>
+          <w:rFonts w:ascii="Times New Roman" w:hAnsi="Times New Roman" w:cs="Times New Roman"/>
+        </w:rPr>
+      </w:pPr>
+    </w:p>
+    <w:p>
+      <w:pPr>
+        <w:pStyle w:val="ListParagraph"/>
+        <w:spacing w:line="360" w:lineRule="auto"/>
+        <w:ind w:left="1440"/>
+        <w:rPr>
+          <w:rFonts w:ascii="Times New Roman" w:hAnsi="Times New Roman" w:cs="Times New Roman"/>
+        </w:rPr>
+      </w:pPr>
+    </w:p>
+    <w:p>
+      <w:pPr>
+        <w:pStyle w:val="ListParagraph"/>
+        <w:spacing w:line="360" w:lineRule="auto"/>
+        <w:rPr>
+          <w:rFonts w:ascii="Times New Roman" w:hAnsi="Times New Roman" w:cs="Times New Roman"/>
+        </w:rPr>
+      </w:pPr>
+    </w:p>
+    <w:p>
+      <w:pPr>
+        <w:pStyle w:val="ListParagraph"/>
+        <w:spacing w:line="360" w:lineRule="auto"/>
+        <w:rPr>
+          <w:rFonts w:ascii="Times New Roman" w:hAnsi="Times New Roman" w:cs="Times New Roman"/>
+        </w:rPr>
+      </w:pPr>
+    </w:p>
+    <w:p>
+      <w:pPr>
+        <w:pStyle w:val="ListParagraph"/>
+        <w:spacing w:line="360" w:lineRule="auto"/>
+        <w:rPr>
+          <w:rFonts w:ascii="Times New Roman" w:hAnsi="Times New Roman" w:cs="Times New Roman"/>
+        </w:rPr>
+      </w:pPr>
+    </w:p>
+    <w:p>
+      <w:pPr>
+        <w:pStyle w:val="ListParagraph"/>
+        <w:spacing w:line="360" w:lineRule="auto"/>
+        <w:rPr>
+          <w:rFonts w:ascii="Times New Roman" w:hAnsi="Times New Roman" w:cs="Times New Roman"/>
+        </w:rPr>
+      </w:pPr>
+      <w:r>
+        <w:rPr>
+          <w:rFonts w:ascii="Times New Roman" w:hAnsi="Times New Roman" w:cs="Times New Roman"/>
+        </w:rPr>
+        <w:lastRenderedPageBreak/>
+        <w:t>-</w:t>
+      </w:r>
+      <w:r>
+        <w:rPr>
+          <w:rFonts w:ascii="Times New Roman" w:hAnsi="Times New Roman" w:cs="Times New Roman"/>
+        </w:rPr>
+        <w:tab/>
+      </w:r>
+      <w:r>
+        <w:rPr>
+          <w:rFonts w:ascii="Times New Roman" w:hAnsi="Times New Roman" w:cs="Times New Roman"/>
+        </w:rPr>
+        <w:t>Sequence</w:t>
+      </w:r>
+    </w:p>
+    <w:p>
+      <w:pPr>
+        <w:pStyle w:val="ListParagraph"/>
+        <w:numPr>
+          <w:ilvl w:val="1"/>
+          <w:numId w:val="5"/>
+        </w:numPr>
+        <w:spacing w:line="360" w:lineRule="auto"/>
+        <w:rPr>
+          <w:rFonts w:ascii="Times New Roman" w:hAnsi="Times New Roman" w:cs="Times New Roman"/>
+        </w:rPr>
+      </w:pPr>
+      <w:proofErr w:type="spellStart"/>
+      <w:r>
+        <w:rPr>
+          <w:rFonts w:ascii="Times New Roman" w:hAnsi="Times New Roman" w:cs="Times New Roman"/>
+        </w:rPr>
+        <w:t>Đặt</w:t>
+      </w:r>
+      <w:proofErr w:type="spellEnd"/>
+      <w:r>
+        <w:rPr>
+          <w:rFonts w:ascii="Times New Roman" w:hAnsi="Times New Roman" w:cs="Times New Roman"/>
+        </w:rPr>
+        <w:t xml:space="preserve"> </w:t>
+      </w:r>
+      <w:proofErr w:type="spellStart"/>
+      <w:r>
+        <w:rPr>
+          <w:rFonts w:ascii="Times New Roman" w:hAnsi="Times New Roman" w:cs="Times New Roman"/>
+        </w:rPr>
+        <w:t>hàng</w:t>
+      </w:r>
+      <w:proofErr w:type="spellEnd"/>
+    </w:p>
+    <w:p>
+      <w:pPr>
+        <w:pStyle w:val="NormalWeb"/>
+        <w:ind w:left="720"/>
+      </w:pPr>
+      <w:r>
+        <w:rPr>
+          <w:noProof/>
+        </w:rPr>
+        <w:drawing>
+          <wp:inline distT="0" distB="0" distL="0" distR="0" wp14:anchorId="632F995E" wp14:editId="4164DE14">
+            <wp:extent cx="5859780" cy="3616034"/>
+            <wp:effectExtent l="0" t="0" r="7620" b="3810"/>
+            <wp:docPr id="1654875353" name="Picture 3" descr="A diagram with text and black text&#10;&#10;AI-generated content may be incorrect."/>
+            <wp:cNvGraphicFramePr>
+              <a:graphicFrameLocks xmlns:a="http://schemas.openxmlformats.org/drawingml/2006/main" noChangeAspect="1"/>
+            </wp:cNvGraphicFramePr>
+            <a:graphic xmlns:a="http://schemas.openxmlformats.org/drawingml/2006/main">
+              <a:graphicData uri="http://schemas.openxmlformats.org/drawingml/2006/picture">
+                <pic:pic xmlns:pic="http://schemas.openxmlformats.org/drawingml/2006/picture">
+                  <pic:nvPicPr>
+                    <pic:cNvPr id="1654875353" name="Picture 3" descr="A diagram with text and black text&#10;&#10;AI-generated content may be incorrect."/>
+                    <pic:cNvPicPr>
+                      <a:picLocks noChangeAspect="1" noChangeArrowheads="1"/>
+                    </pic:cNvPicPr>
+                  </pic:nvPicPr>
+                  <pic:blipFill>
+                    <a:blip r:embed="rId8">
+                      <a:extLst>
+                        <a:ext uri="{28A0092B-C50C-407E-A947-70E740481C1C}">
+                          <a14:useLocalDpi xmlns:a14="http://schemas.microsoft.com/office/drawing/2010/main" val="0"/>
+                        </a:ext>
+                      </a:extLst>
+                    </a:blip>
+                    <a:srcRect/>
+                    <a:stretch>
+                      <a:fillRect/>
+                    </a:stretch>
+                  </pic:blipFill>
+                  <pic:spPr bwMode="auto">
+                    <a:xfrm>
+                      <a:off x="0" y="0"/>
+                      <a:ext cx="5899149" cy="3640328"/>
+                    </a:xfrm>
+                    <a:prstGeom prst="rect">
+                      <a:avLst/>
+                    </a:prstGeom>
+                    <a:noFill/>
+                    <a:ln>
+                      <a:noFill/>
+                    </a:ln>
+                  </pic:spPr>
+                </pic:pic>
+              </a:graphicData>
+            </a:graphic>
+          </wp:inline>
+        </w:drawing>
+      </w:r>
+    </w:p>
+    <w:p>
+      <w:pPr>
+        <w:pStyle w:val="NormalWeb"/>
+        <w:ind w:left="720"/>
+      </w:pPr>
+    </w:p>
+    <w:p>
+      <w:pPr>
+        <w:pStyle w:val="NormalWeb"/>
+        <w:ind w:left="720"/>
+      </w:pPr>
+    </w:p>
+    <w:p>
+      <w:pPr>
+        <w:pStyle w:val="NormalWeb"/>
+        <w:ind w:left="720"/>
+      </w:pPr>
+    </w:p>
+    <w:p>
+      <w:pPr>
+        <w:pStyle w:val="NormalWeb"/>
+        <w:ind w:left="720"/>
+      </w:pPr>
+    </w:p>
+    <w:p>
+      <w:pPr>
+        <w:pStyle w:val="NormalWeb"/>
+        <w:ind w:left="720"/>
+      </w:pPr>
+    </w:p>
+    <w:p>
+      <w:pPr>
+        <w:pStyle w:val="NormalWeb"/>
+        <w:ind w:left="720"/>
+      </w:pPr>
+    </w:p>
+    <w:p>
+      <w:pPr>
+        <w:pStyle w:val="NormalWeb"/>
+        <w:ind w:left="720"/>
+      </w:pPr>
+    </w:p>
+    <w:p>
+      <w:pPr>
+        <w:pStyle w:val="NormalWeb"/>
+        <w:ind w:left="720"/>
+      </w:pPr>
+    </w:p>
+    <w:p>
+      <w:pPr>
+        <w:pStyle w:val="NormalWeb"/>
+        <w:ind w:left="720"/>
+      </w:pPr>
+    </w:p>
+    <w:p>
+      <w:pPr>
+        <w:pStyle w:val="NormalWeb"/>
+        <w:ind w:left="720"/>
+      </w:pPr>
+    </w:p>
+    <w:p>
+      <w:pPr>
+        <w:pStyle w:val="NormalWeb"/>
+        <w:ind w:left="720"/>
+      </w:pPr>
+    </w:p>
+    <w:p>
+      <w:pPr>
+        <w:pStyle w:val="NormalWeb"/>
+        <w:numPr>
+          <w:ilvl w:val="0"/>
+          <w:numId w:val="5"/>
+        </w:numPr>
+      </w:pPr>
+      <w:r>
+        <w:lastRenderedPageBreak/>
+        <w:t>Activity</w:t>
+      </w:r>
+    </w:p>
+    <w:p>
+      <w:pPr>
+        <w:pStyle w:val="NormalWeb"/>
+        <w:numPr>
+          <w:ilvl w:val="1"/>
+          <w:numId w:val="5"/>
+        </w:numPr>
+      </w:pPr>
+      <w:r>
+        <w:t xml:space="preserve">Giao </w:t>
+      </w:r>
+      <w:proofErr w:type="spellStart"/>
+      <w:r>
+        <w:t>hàng</w:t>
+      </w:r>
+      <w:proofErr w:type="spellEnd"/>
+    </w:p>
+    <w:p>
+      <w:pPr>
+        <w:pStyle w:val="NormalWeb"/>
+        <w:numPr>
+          <w:ilvl w:val="0"/>
+          <w:numId w:val="5"/>
+        </w:numPr>
+      </w:pPr>
+      <w:r>
+        <w:rPr>
+          <w:noProof/>
+        </w:rPr>
+        <w:drawing>
+          <wp:inline distT="0" distB="0" distL="0" distR="0" wp14:anchorId="7CDDD4B3" wp14:editId="53124111">
+            <wp:extent cx="3512211" cy="7673340"/>
+            <wp:effectExtent l="0" t="0" r="0" b="3810"/>
+            <wp:docPr id="725507181" name="Picture 9" descr="A diagram of a flight&#10;&#10;AI-generated content may be incorrect."/>
+            <wp:cNvGraphicFramePr>
+              <a:graphicFrameLocks xmlns:a="http://schemas.openxmlformats.org/drawingml/2006/main" noChangeAspect="1"/>
+            </wp:cNvGraphicFramePr>
+            <a:graphic xmlns:a="http://schemas.openxmlformats.org/drawingml/2006/main">
+              <a:graphicData uri="http://schemas.openxmlformats.org/drawingml/2006/picture">
+                <pic:pic xmlns:pic="http://schemas.openxmlformats.org/drawingml/2006/picture">
+                  <pic:nvPicPr>
+                    <pic:cNvPr id="725507181" name="Picture 9" descr="A diagram of a flight&#10;&#10;AI-generated content may be incorrect."/>
+                    <pic:cNvPicPr>
+                      <a:picLocks noChangeAspect="1" noChangeArrowheads="1"/>
+                    </pic:cNvPicPr>
+                  </pic:nvPicPr>
+                  <pic:blipFill>
+                    <a:blip r:embed="rId9">
+                      <a:extLst>
+                        <a:ext uri="{28A0092B-C50C-407E-A947-70E740481C1C}">
+                          <a14:useLocalDpi xmlns:a14="http://schemas.microsoft.com/office/drawing/2010/main" val="0"/>
+                        </a:ext>
+                      </a:extLst>
+                    </a:blip>
+                    <a:srcRect/>
+                    <a:stretch>
+                      <a:fillRect/>
+                    </a:stretch>
+                  </pic:blipFill>
+                  <pic:spPr bwMode="auto">
+                    <a:xfrm>
+                      <a:off x="0" y="0"/>
+                      <a:ext cx="3515228" cy="7679931"/>
+                    </a:xfrm>
+                    <a:prstGeom prst="rect">
+                      <a:avLst/>
+                    </a:prstGeom>
+                    <a:noFill/>
+                    <a:ln>
+                      <a:noFill/>
+                    </a:ln>
+                  </pic:spPr>
+                </pic:pic>
+              </a:graphicData>
+            </a:graphic>
+          </wp:inline>
+        </w:drawing>
+      </w:r>
+    </w:p>
+    <w:p>
+      <w:pPr>
+        <w:pStyle w:val="NormalWeb"/>
+        <w:ind w:left="720"/>
+      </w:pPr>
+    </w:p>
+    <w:p>
+      <w:pPr>
+        <w:pStyle w:val="NormalWeb"/>
+        <w:numPr>
+          <w:ilvl w:val="0"/>
+          <w:numId w:val="5"/>
+        </w:numPr>
+      </w:pPr>
+      <w:r>
+        <w:t>Sequence</w:t>
+      </w:r>
+    </w:p>
+    <w:p>
+      <w:pPr>
+        <w:pStyle w:val="NormalWeb"/>
+        <w:numPr>
+          <w:ilvl w:val="1"/>
+          <w:numId w:val="5"/>
+        </w:numPr>
+      </w:pPr>
+      <w:r>
+        <w:t xml:space="preserve">Giao </w:t>
+      </w:r>
+      <w:proofErr w:type="spellStart"/>
+      <w:r>
+        <w:t>hàng</w:t>
+      </w:r>
+      <w:proofErr w:type="spellEnd"/>
+    </w:p>
+    <w:p>
+      <w:pPr>
+        <w:pStyle w:val="ListParagraph"/>
+        <w:spacing w:line="360" w:lineRule="auto"/>
+        <w:ind w:left="1440"/>
+        <w:rPr>
+          <w:rFonts w:ascii="Times New Roman" w:hAnsi="Times New Roman" w:cs="Times New Roman"/>
+        </w:rPr>
+      </w:pPr>
+      <w:r>
+        <w:rPr>
+          <w:noProof/>
+        </w:rPr>
+        <w:drawing>
+          <wp:inline distT="0" distB="0" distL="0" distR="0" wp14:anchorId="37094B97" wp14:editId="2C5F5940">
+            <wp:extent cx="5289419" cy="2880360"/>
+            <wp:effectExtent l="0" t="0" r="6985" b="0"/>
+            <wp:docPr id="1602289567" name="Picture 7" descr="A diagram of a delivery service&#10;&#10;AI-generated content may be incorrect."/>
+            <wp:cNvGraphicFramePr>
+              <a:graphicFrameLocks xmlns:a="http://schemas.openxmlformats.org/drawingml/2006/main" noChangeAspect="1"/>
+            </wp:cNvGraphicFramePr>
+            <a:graphic xmlns:a="http://schemas.openxmlformats.org/drawingml/2006/main">
+              <a:graphicData uri="http://schemas.openxmlformats.org/drawingml/2006/picture">
+                <pic:pic xmlns:pic="http://schemas.openxmlformats.org/drawingml/2006/picture">
+                  <pic:nvPicPr>
+                    <pic:cNvPr id="1602289567" name="Picture 7" descr="A diagram of a delivery service&#10;&#10;AI-generated content may be incorrect."/>
+                    <pic:cNvPicPr>
+                      <a:picLocks noChangeAspect="1" noChangeArrowheads="1"/>
+                    </pic:cNvPicPr>
+                  </pic:nvPicPr>
+                  <pic:blipFill>
+                    <a:blip r:embed="rId10">
+                      <a:extLst>
+                        <a:ext uri="{28A0092B-C50C-407E-A947-70E740481C1C}">
+                          <a14:useLocalDpi xmlns:a14="http://schemas.microsoft.com/office/drawing/2010/main" val="0"/>
+                        </a:ext>
+                      </a:extLst>
+                    </a:blip>
+                    <a:srcRect/>
+                    <a:stretch>
+                      <a:fillRect/>
+                    </a:stretch>
+                  </pic:blipFill>
+                  <pic:spPr bwMode="auto">
+                    <a:xfrm>
+                      <a:off x="0" y="0"/>
+                      <a:ext cx="5293793" cy="2882742"/>
+                    </a:xfrm>
+                    <a:prstGeom prst="rect">
+                      <a:avLst/>
+                    </a:prstGeom>
+                    <a:noFill/>
+                    <a:ln>
+                      <a:noFill/>
+                    </a:ln>
+                  </pic:spPr>
+                </pic:pic>
+              </a:graphicData>
+            </a:graphic>
+          </wp:inline>
+        </w:drawing>
+      </w:r>
+    </w:p>
+    <w:p>
+      <w:pPr>
+        <w:pStyle w:val="ListParagraph"/>
+        <w:numPr>
+          <w:ilvl w:val="0"/>
+          <w:numId w:val="5"/>
+        </w:numPr>
+        <w:spacing w:line="360" w:lineRule="auto"/>
+        <w:rPr>
+          <w:rFonts w:ascii="Times New Roman" w:hAnsi="Times New Roman" w:cs="Times New Roman"/>
+        </w:rPr>
+      </w:pPr>
+      <w:r>
+        <w:rPr>
+          <w:rFonts w:ascii="Times New Roman" w:hAnsi="Times New Roman" w:cs="Times New Roman"/>
+        </w:rPr>
+        <w:t>Activity</w:t>
+      </w:r>
+    </w:p>
+    <w:p>
+      <w:pPr>
+        <w:pStyle w:val="NormalWeb"/>
+      </w:pPr>
+      <w:r>
+        <w:drawing>
+          <wp:inline distT="0" distB="0" distL="0" distR="0" wp14:anchorId="414701E8" wp14:editId="66FFD9B7">
+            <wp:extent cx="6416675" cy="3901440"/>
+            <wp:effectExtent l="0" t="0" r="3175" b="3810"/>
+            <wp:docPr id="1454614551" name="Picture 13" descr="A screenshot of a computer&#10;&#10;AI-generated content may be incorrect."/>
+            <wp:cNvGraphicFramePr>
+              <a:graphicFrameLocks xmlns:a="http://schemas.openxmlformats.org/drawingml/2006/main" noChangeAspect="1"/>
+            </wp:cNvGraphicFramePr>
+            <a:graphic xmlns:a="http://schemas.openxmlformats.org/drawingml/2006/main">
+              <a:graphicData uri="http://schemas.openxmlformats.org/drawingml/2006/picture">
+                <pic:pic xmlns:pic="http://schemas.openxmlformats.org/drawingml/2006/picture">
+                  <pic:nvPicPr>
+                    <pic:cNvPr id="1454614551" name="Picture 13" descr="A screenshot of a computer&#10;&#10;AI-generated content may be incorrect."/>
+                    <pic:cNvPicPr>
+                      <a:picLocks noChangeAspect="1" noChangeArrowheads="1"/>
+                    </pic:cNvPicPr>
+                  </pic:nvPicPr>
+                  <pic:blipFill>
+                    <a:blip r:embed="rId11" cstate="print">
+                      <a:extLst>
+                        <a:ext uri="{28A0092B-C50C-407E-A947-70E740481C1C}">
+                          <a14:useLocalDpi xmlns:a14="http://schemas.microsoft.com/office/drawing/2010/main" val="0"/>
+                        </a:ext>
+                      </a:extLst>
+                    </a:blip>
+                    <a:srcRect/>
+                    <a:stretch>
+                      <a:fillRect/>
+                    </a:stretch>
+                  </pic:blipFill>
+                  <pic:spPr bwMode="auto">
+                    <a:xfrm>
+                      <a:off x="0" y="0"/>
+                      <a:ext cx="6419874" cy="3903385"/>
+                    </a:xfrm>
+                    <a:prstGeom prst="rect">
+                      <a:avLst/>
+                    </a:prstGeom>
+                    <a:noFill/>
+                    <a:ln>
+                      <a:noFill/>
+                    </a:ln>
+                  </pic:spPr>
+                </pic:pic>
+              </a:graphicData>
+            </a:graphic>
+          </wp:inline>
+        </w:drawing>
+      </w:r>
+    </w:p>
+    <w:p>
+      <w:pPr>
+        <w:pStyle w:val="NormalWeb"/>
+        <w:numPr>
+          <w:ilvl w:val="0"/>
+          <w:numId w:val="5"/>
+        </w:numPr>
+      </w:pPr>
+      <w:r>
+        <w:lastRenderedPageBreak/>
+        <w:t>Sequence</w:t>
+      </w:r>
+    </w:p>
+    <w:p>
+      <w:pPr>
+        <w:pStyle w:val="NormalWeb"/>
+        <w:ind w:left="720"/>
+      </w:pPr>
+      <w:r>
+        <w:rPr>
+          <w:noProof/>
+        </w:rPr>
+        <w:drawing>
+          <wp:inline distT="0" distB="0" distL="0" distR="0" wp14:anchorId="2EB5C772" wp14:editId="10359EEE">
+            <wp:extent cx="5943600" cy="3826510"/>
+            <wp:effectExtent l="0" t="0" r="0" b="2540"/>
+            <wp:docPr id="1862980643" name="Picture 20" descr="A screenshot of a computer screen&#10;&#10;AI-generated content may be incorrect."/>
+            <wp:cNvGraphicFramePr>
+              <a:graphicFrameLocks xmlns:a="http://schemas.openxmlformats.org/drawingml/2006/main" noChangeAspect="1"/>
+            </wp:cNvGraphicFramePr>
+            <a:graphic xmlns:a="http://schemas.openxmlformats.org/drawingml/2006/main">
+              <a:graphicData uri="http://schemas.openxmlformats.org/drawingml/2006/picture">
+                <pic:pic xmlns:pic="http://schemas.openxmlformats.org/drawingml/2006/picture">
+                  <pic:nvPicPr>
+                    <pic:cNvPr id="1862980643" name="Picture 20" descr="A screenshot of a computer screen&#10;&#10;AI-generated content may be incorrect."/>
+                    <pic:cNvPicPr>
+                      <a:picLocks noChangeAspect="1" noChangeArrowheads="1"/>
+                    </pic:cNvPicPr>
+                  </pic:nvPicPr>
+                  <pic:blipFill>
+                    <a:blip r:embed="rId12" cstate="print">
+                      <a:extLst>
+                        <a:ext uri="{28A0092B-C50C-407E-A947-70E740481C1C}">
+                          <a14:useLocalDpi xmlns:a14="http://schemas.microsoft.com/office/drawing/2010/main" val="0"/>
+                        </a:ext>
+                      </a:extLst>
+                    </a:blip>
+                    <a:srcRect/>
+                    <a:stretch>
+                      <a:fillRect/>
+                    </a:stretch>
+                  </pic:blipFill>
+                  <pic:spPr bwMode="auto">
+                    <a:xfrm>
+                      <a:off x="0" y="0"/>
+                      <a:ext cx="5943600" cy="3826510"/>
+                    </a:xfrm>
+                    <a:prstGeom prst="rect">
+                      <a:avLst/>
+                    </a:prstGeom>
+                    <a:noFill/>
+                    <a:ln>
+                      <a:noFill/>
+                    </a:ln>
+                  </pic:spPr>
+                </pic:pic>
+              </a:graphicData>
+            </a:graphic>
+          </wp:inline>
+        </w:drawing>
+      </w:r>
+    </w:p>
+    <w:p>
+      <w:pPr>
+        <w:spacing w:line="360" w:lineRule="auto"/>
+        <w:rPr>
+          <w:rFonts w:ascii="Times New Roman" w:hAnsi="Times New Roman" w:cs="Times New Roman"/>
+          <w:b/>
+          <w:bCs/>
+          <w:sz w:val="28"/>
+          <w:szCs w:val="28"/>
+        </w:rPr>
+      </w:pPr>
+      <w:r>
+        <w:rPr>
+          <w:rFonts w:ascii="Times New Roman" w:hAnsi="Times New Roman" w:cs="Times New Roman"/>
+          <w:b/>
+          <w:bCs/>
+          <w:sz w:val="28"/>
+          <w:szCs w:val="28"/>
+        </w:rPr>
         <w:t>Key Logic</w:t>
       </w:r>
     </w:p>
@@ -7234,6 +8018,7 @@
         <w:rPr>
           <w:rFonts w:ascii="Times New Roman" w:hAnsi="Times New Roman" w:cs="Times New Roman"/>
         </w:rPr>
+        <w:lastRenderedPageBreak/>
         <w:t>Hệ</w:t>
       </w:r>
       <w:proofErr w:type="spellEnd"/>
@@ -9027,7 +9812,6 @@
         <w:rPr>
           <w:rFonts w:ascii="Times New Roman" w:hAnsi="Times New Roman" w:cs="Times New Roman"/>
         </w:rPr>
-        <w:lastRenderedPageBreak/>
         <w:t xml:space="preserve">Sau </w:t>
       </w:r>
       <w:proofErr w:type="spellStart"/>
@@ -9943,28 +10727,1372 @@
         <w:spacing w:line="360" w:lineRule="auto"/>
         <w:rPr>
           <w:rFonts w:ascii="Times New Roman" w:hAnsi="Times New Roman" w:cs="Times New Roman"/>
-        </w:rPr>
-      </w:pPr>
-    </w:p>
-    <w:p>
-      <w:pPr>
-        <w:spacing w:line="360" w:lineRule="auto"/>
-        <w:rPr>
-          <w:rFonts w:ascii="Times New Roman" w:hAnsi="Times New Roman" w:cs="Times New Roman"/>
-        </w:rPr>
-      </w:pPr>
-    </w:p>
-    <w:p>
-      <w:pPr>
-        <w:spacing w:line="360" w:lineRule="auto"/>
-        <w:rPr>
-          <w:rFonts w:ascii="Times New Roman" w:hAnsi="Times New Roman" w:cs="Times New Roman"/>
           <w:b/>
           <w:bCs/>
           <w:sz w:val="28"/>
           <w:szCs w:val="28"/>
         </w:rPr>
       </w:pPr>
+    </w:p>
+    <w:p>
+      <w:pPr>
+        <w:spacing w:line="360" w:lineRule="auto"/>
+        <w:rPr>
+          <w:rFonts w:ascii="Times New Roman" w:hAnsi="Times New Roman" w:cs="Times New Roman"/>
+          <w:b/>
+          <w:bCs/>
+          <w:sz w:val="28"/>
+          <w:szCs w:val="28"/>
+        </w:rPr>
+      </w:pPr>
+    </w:p>
+    <w:p>
+      <w:pPr>
+        <w:spacing w:line="360" w:lineRule="auto"/>
+        <w:rPr>
+          <w:rFonts w:ascii="Times New Roman" w:hAnsi="Times New Roman" w:cs="Times New Roman"/>
+          <w:b/>
+          <w:bCs/>
+          <w:sz w:val="28"/>
+          <w:szCs w:val="28"/>
+        </w:rPr>
+      </w:pPr>
+    </w:p>
+    <w:p>
+      <w:pPr>
+        <w:spacing w:line="360" w:lineRule="auto"/>
+        <w:rPr>
+          <w:rFonts w:ascii="Times New Roman" w:hAnsi="Times New Roman" w:cs="Times New Roman"/>
+          <w:b/>
+          <w:bCs/>
+          <w:sz w:val="28"/>
+          <w:szCs w:val="28"/>
+        </w:rPr>
+      </w:pPr>
+    </w:p>
+    <w:p>
+      <w:pPr>
+        <w:spacing w:line="360" w:lineRule="auto"/>
+        <w:rPr>
+          <w:rFonts w:ascii="Times New Roman" w:hAnsi="Times New Roman" w:cs="Times New Roman"/>
+          <w:b/>
+          <w:bCs/>
+          <w:sz w:val="28"/>
+          <w:szCs w:val="28"/>
+        </w:rPr>
+      </w:pPr>
+    </w:p>
+    <w:p>
+      <w:pPr>
+        <w:spacing w:line="360" w:lineRule="auto"/>
+        <w:rPr>
+          <w:rFonts w:ascii="Times New Roman" w:hAnsi="Times New Roman" w:cs="Times New Roman"/>
+          <w:b/>
+          <w:bCs/>
+          <w:sz w:val="28"/>
+          <w:szCs w:val="28"/>
+        </w:rPr>
+      </w:pPr>
+      <w:r>
+        <w:rPr>
+          <w:rFonts w:ascii="Times New Roman" w:hAnsi="Times New Roman" w:cs="Times New Roman"/>
+          <w:b/>
+          <w:bCs/>
+          <w:sz w:val="28"/>
+          <w:szCs w:val="28"/>
+        </w:rPr>
+        <w:lastRenderedPageBreak/>
+        <w:t>Component</w:t>
+      </w:r>
+    </w:p>
+    <w:p>
+      <w:pPr>
+        <w:spacing w:line="360" w:lineRule="auto"/>
+        <w:rPr>
+          <w:rFonts w:ascii="Times New Roman" w:hAnsi="Times New Roman" w:cs="Times New Roman"/>
+        </w:rPr>
+      </w:pPr>
+      <w:r>
+        <w:rPr>
+          <w:rFonts w:ascii="Times New Roman" w:hAnsi="Times New Roman" w:cs="Times New Roman"/>
+        </w:rPr>
+        <w:drawing>
+          <wp:inline distT="0" distB="0" distL="0" distR="0" wp14:anchorId="2A11F3D3" wp14:editId="10B7B1A0">
+            <wp:extent cx="5943600" cy="2199005"/>
+            <wp:effectExtent l="0" t="0" r="0" b="0"/>
+            <wp:docPr id="1208863428" name="Picture 15" descr="A diagram of a computer&#10;&#10;AI-generated content may be incorrect."/>
+            <wp:cNvGraphicFramePr>
+              <a:graphicFrameLocks xmlns:a="http://schemas.openxmlformats.org/drawingml/2006/main" noChangeAspect="1"/>
+            </wp:cNvGraphicFramePr>
+            <a:graphic xmlns:a="http://schemas.openxmlformats.org/drawingml/2006/main">
+              <a:graphicData uri="http://schemas.openxmlformats.org/drawingml/2006/picture">
+                <pic:pic xmlns:pic="http://schemas.openxmlformats.org/drawingml/2006/picture">
+                  <pic:nvPicPr>
+                    <pic:cNvPr id="1208863428" name="Picture 15" descr="A diagram of a computer&#10;&#10;AI-generated content may be incorrect."/>
+                    <pic:cNvPicPr>
+                      <a:picLocks noChangeAspect="1" noChangeArrowheads="1"/>
+                    </pic:cNvPicPr>
+                  </pic:nvPicPr>
+                  <pic:blipFill>
+                    <a:blip r:embed="rId13" cstate="print">
+                      <a:extLst>
+                        <a:ext uri="{28A0092B-C50C-407E-A947-70E740481C1C}">
+                          <a14:useLocalDpi xmlns:a14="http://schemas.microsoft.com/office/drawing/2010/main" val="0"/>
+                        </a:ext>
+                      </a:extLst>
+                    </a:blip>
+                    <a:srcRect/>
+                    <a:stretch>
+                      <a:fillRect/>
+                    </a:stretch>
+                  </pic:blipFill>
+                  <pic:spPr bwMode="auto">
+                    <a:xfrm>
+                      <a:off x="0" y="0"/>
+                      <a:ext cx="5943600" cy="2199005"/>
+                    </a:xfrm>
+                    <a:prstGeom prst="rect">
+                      <a:avLst/>
+                    </a:prstGeom>
+                    <a:noFill/>
+                    <a:ln>
+                      <a:noFill/>
+                    </a:ln>
+                  </pic:spPr>
+                </pic:pic>
+              </a:graphicData>
+            </a:graphic>
+          </wp:inline>
+        </w:drawing>
+      </w:r>
+    </w:p>
+    <w:p>
+      <w:pPr>
+        <w:spacing w:line="360" w:lineRule="auto"/>
+        <w:rPr>
+          <w:rFonts w:ascii="Times New Roman" w:hAnsi="Times New Roman" w:cs="Times New Roman"/>
+        </w:rPr>
+      </w:pPr>
+    </w:p>
+    <w:p>
+      <w:pPr>
+        <w:spacing w:line="360" w:lineRule="auto"/>
+        <w:rPr>
+          <w:rFonts w:ascii="Times New Roman" w:eastAsia="Times New Roman" w:hAnsi="Times New Roman" w:cs="Times New Roman"/>
+          <w:kern w:val="0"/>
+          <w14:ligatures w14:val="none"/>
+        </w:rPr>
+      </w:pPr>
+      <w:r>
+        <w:rPr>
+          <w:b/>
+          <w:bCs/>
+          <w:sz w:val="28"/>
+          <w:szCs w:val="28"/>
+        </w:rPr>
+        <w:drawing>
+          <wp:anchor distT="0" distB="0" distL="114300" distR="114300" simplePos="0" relativeHeight="251658240" behindDoc="0" locked="0" layoutInCell="1" allowOverlap="1" wp14:anchorId="662DD5CF" wp14:editId="2740FF83">
+            <wp:simplePos x="0" y="0"/>
+            <wp:positionH relativeFrom="margin">
+              <wp:posOffset>670560</wp:posOffset>
+            </wp:positionH>
+            <wp:positionV relativeFrom="paragraph">
+              <wp:posOffset>318770</wp:posOffset>
+            </wp:positionV>
+            <wp:extent cx="4686300" cy="2617470"/>
+            <wp:effectExtent l="0" t="0" r="0" b="0"/>
+            <wp:wrapTopAndBottom/>
+            <wp:docPr id="1967906222" name="Picture 17" descr="A screenshot of a computer&#10;&#10;AI-generated content may be incorrect."/>
+            <wp:cNvGraphicFramePr>
+              <a:graphicFrameLocks xmlns:a="http://schemas.openxmlformats.org/drawingml/2006/main" noChangeAspect="1"/>
+            </wp:cNvGraphicFramePr>
+            <a:graphic xmlns:a="http://schemas.openxmlformats.org/drawingml/2006/main">
+              <a:graphicData uri="http://schemas.openxmlformats.org/drawingml/2006/picture">
+                <pic:pic xmlns:pic="http://schemas.openxmlformats.org/drawingml/2006/picture">
+                  <pic:nvPicPr>
+                    <pic:cNvPr id="1967906222" name="Picture 17" descr="A screenshot of a computer&#10;&#10;AI-generated content may be incorrect."/>
+                    <pic:cNvPicPr>
+                      <a:picLocks noChangeAspect="1" noChangeArrowheads="1"/>
+                    </pic:cNvPicPr>
+                  </pic:nvPicPr>
+                  <pic:blipFill>
+                    <a:blip r:embed="rId14">
+                      <a:extLst>
+                        <a:ext uri="{28A0092B-C50C-407E-A947-70E740481C1C}">
+                          <a14:useLocalDpi xmlns:a14="http://schemas.microsoft.com/office/drawing/2010/main" val="0"/>
+                        </a:ext>
+                      </a:extLst>
+                    </a:blip>
+                    <a:srcRect/>
+                    <a:stretch>
+                      <a:fillRect/>
+                    </a:stretch>
+                  </pic:blipFill>
+                  <pic:spPr bwMode="auto">
+                    <a:xfrm>
+                      <a:off x="0" y="0"/>
+                      <a:ext cx="4686300" cy="2617470"/>
+                    </a:xfrm>
+                    <a:prstGeom prst="rect">
+                      <a:avLst/>
+                    </a:prstGeom>
+                    <a:noFill/>
+                    <a:ln>
+                      <a:noFill/>
+                    </a:ln>
+                  </pic:spPr>
+                </pic:pic>
+              </a:graphicData>
+            </a:graphic>
+            <wp14:sizeRelH relativeFrom="margin">
+              <wp14:pctWidth>0</wp14:pctWidth>
+            </wp14:sizeRelH>
+            <wp14:sizeRelV relativeFrom="margin">
+              <wp14:pctHeight>0</wp14:pctHeight>
+            </wp14:sizeRelV>
+          </wp:anchor>
+        </w:drawing>
+      </w:r>
+      <w:r>
+        <w:rPr>
+          <w:rFonts w:ascii="Times New Roman" w:hAnsi="Times New Roman" w:cs="Times New Roman"/>
+          <w:b/>
+          <w:bCs/>
+          <w:sz w:val="28"/>
+          <w:szCs w:val="28"/>
+        </w:rPr>
+        <w:t>Deployment</w:t>
+      </w:r>
+      <w:r>
+        <w:rPr>
+          <w:rFonts w:ascii="Times New Roman" w:eastAsia="Times New Roman" w:hAnsi="Times New Roman" w:cs="Times New Roman"/>
+          <w:kern w:val="0"/>
+          <w14:ligatures w14:val="none"/>
+        </w:rPr>
+        <w:t xml:space="preserve"> </w:t>
+      </w:r>
+    </w:p>
+    <w:p>
+      <w:pPr>
+        <w:spacing w:line="360" w:lineRule="auto"/>
+        <w:rPr>
+          <w:rFonts w:ascii="Times New Roman" w:hAnsi="Times New Roman" w:cs="Times New Roman"/>
+          <w:b/>
+          <w:bCs/>
+          <w:sz w:val="28"/>
+          <w:szCs w:val="28"/>
+        </w:rPr>
+      </w:pPr>
+      <w:r>
+        <w:rPr>
+          <w:rFonts w:ascii="Times New Roman" w:hAnsi="Times New Roman" w:cs="Times New Roman"/>
+          <w:b/>
+          <w:bCs/>
+          <w:sz w:val="28"/>
+          <w:szCs w:val="28"/>
+        </w:rPr>
+        <w:t>Back-end Design</w:t>
+      </w:r>
+    </w:p>
+    <w:p>
+      <w:pPr>
+        <w:spacing w:line="360" w:lineRule="auto"/>
+        <w:rPr>
+          <w:rFonts w:ascii="Times New Roman" w:hAnsi="Times New Roman" w:cs="Times New Roman"/>
+        </w:rPr>
+      </w:pPr>
+      <w:proofErr w:type="spellStart"/>
+      <w:r>
+        <w:rPr>
+          <w:rFonts w:ascii="Times New Roman" w:hAnsi="Times New Roman" w:cs="Times New Roman"/>
+        </w:rPr>
+        <w:t>Mô</w:t>
+      </w:r>
+      <w:proofErr w:type="spellEnd"/>
+      <w:r>
+        <w:rPr>
+          <w:rFonts w:ascii="Times New Roman" w:hAnsi="Times New Roman" w:cs="Times New Roman"/>
+        </w:rPr>
+        <w:t xml:space="preserve"> </w:t>
+      </w:r>
+      <w:proofErr w:type="spellStart"/>
+      <w:r>
+        <w:rPr>
+          <w:rFonts w:ascii="Times New Roman" w:hAnsi="Times New Roman" w:cs="Times New Roman"/>
+        </w:rPr>
+        <w:t>tả</w:t>
+      </w:r>
+      <w:proofErr w:type="spellEnd"/>
+      <w:r>
+        <w:rPr>
+          <w:rFonts w:ascii="Times New Roman" w:hAnsi="Times New Roman" w:cs="Times New Roman"/>
+        </w:rPr>
+        <w:t>:</w:t>
+      </w:r>
+    </w:p>
+    <w:p>
+      <w:pPr>
+        <w:spacing w:line="360" w:lineRule="auto"/>
+        <w:rPr>
+          <w:rFonts w:ascii="Times New Roman" w:hAnsi="Times New Roman" w:cs="Times New Roman"/>
+        </w:rPr>
+      </w:pPr>
+      <w:r>
+        <w:rPr>
+          <w:rFonts w:ascii="Times New Roman" w:hAnsi="Times New Roman" w:cs="Times New Roman"/>
+        </w:rPr>
+        <w:t xml:space="preserve">  </w:t>
+      </w:r>
+      <w:proofErr w:type="spellStart"/>
+      <w:r>
+        <w:rPr>
+          <w:rFonts w:ascii="Times New Roman" w:hAnsi="Times New Roman" w:cs="Times New Roman"/>
+        </w:rPr>
+        <w:t>Hệ</w:t>
+      </w:r>
+      <w:proofErr w:type="spellEnd"/>
+      <w:r>
+        <w:rPr>
+          <w:rFonts w:ascii="Times New Roman" w:hAnsi="Times New Roman" w:cs="Times New Roman"/>
+        </w:rPr>
+        <w:t xml:space="preserve"> </w:t>
+      </w:r>
+      <w:proofErr w:type="spellStart"/>
+      <w:r>
+        <w:rPr>
+          <w:rFonts w:ascii="Times New Roman" w:hAnsi="Times New Roman" w:cs="Times New Roman"/>
+        </w:rPr>
+        <w:t>thống</w:t>
+      </w:r>
+      <w:proofErr w:type="spellEnd"/>
+      <w:r>
+        <w:rPr>
+          <w:rFonts w:ascii="Times New Roman" w:hAnsi="Times New Roman" w:cs="Times New Roman"/>
+        </w:rPr>
+        <w:t xml:space="preserve"> </w:t>
+      </w:r>
+      <w:proofErr w:type="spellStart"/>
+      <w:r>
+        <w:rPr>
+          <w:rFonts w:ascii="Times New Roman" w:hAnsi="Times New Roman" w:cs="Times New Roman"/>
+        </w:rPr>
+        <w:t>FoodFastDelivery</w:t>
+      </w:r>
+      <w:proofErr w:type="spellEnd"/>
+      <w:r>
+        <w:rPr>
+          <w:rFonts w:ascii="Times New Roman" w:hAnsi="Times New Roman" w:cs="Times New Roman"/>
+        </w:rPr>
+        <w:t xml:space="preserve"> </w:t>
+      </w:r>
+      <w:proofErr w:type="spellStart"/>
+      <w:r>
+        <w:rPr>
+          <w:rFonts w:ascii="Times New Roman" w:hAnsi="Times New Roman" w:cs="Times New Roman"/>
+        </w:rPr>
+        <w:t>gồm</w:t>
+      </w:r>
+      <w:proofErr w:type="spellEnd"/>
+      <w:r>
+        <w:rPr>
+          <w:rFonts w:ascii="Times New Roman" w:hAnsi="Times New Roman" w:cs="Times New Roman"/>
+        </w:rPr>
+        <w:t xml:space="preserve"> </w:t>
+      </w:r>
+      <w:proofErr w:type="spellStart"/>
+      <w:r>
+        <w:rPr>
+          <w:rFonts w:ascii="Times New Roman" w:hAnsi="Times New Roman" w:cs="Times New Roman"/>
+        </w:rPr>
+        <w:t>các</w:t>
+      </w:r>
+      <w:proofErr w:type="spellEnd"/>
+      <w:r>
+        <w:rPr>
+          <w:rFonts w:ascii="Times New Roman" w:hAnsi="Times New Roman" w:cs="Times New Roman"/>
+        </w:rPr>
+        <w:t xml:space="preserve"> module:</w:t>
+      </w:r>
+    </w:p>
+    <w:p>
+      <w:pPr>
+        <w:spacing w:line="360" w:lineRule="auto"/>
+        <w:rPr>
+          <w:rFonts w:ascii="Times New Roman" w:hAnsi="Times New Roman" w:cs="Times New Roman"/>
+        </w:rPr>
+      </w:pPr>
+      <w:r>
+        <w:rPr>
+          <w:rFonts w:ascii="Times New Roman" w:hAnsi="Times New Roman" w:cs="Times New Roman"/>
+        </w:rPr>
+        <w:t xml:space="preserve">   - Authentication &amp; JWT</w:t>
+      </w:r>
+    </w:p>
+    <w:p>
+      <w:pPr>
+        <w:spacing w:line="360" w:lineRule="auto"/>
+        <w:rPr>
+          <w:rFonts w:ascii="Times New Roman" w:hAnsi="Times New Roman" w:cs="Times New Roman"/>
+        </w:rPr>
+      </w:pPr>
+      <w:r>
+        <w:rPr>
+          <w:rFonts w:ascii="Times New Roman" w:hAnsi="Times New Roman" w:cs="Times New Roman"/>
+        </w:rPr>
+        <w:t xml:space="preserve">   - Quản </w:t>
+      </w:r>
+      <w:proofErr w:type="spellStart"/>
+      <w:r>
+        <w:rPr>
+          <w:rFonts w:ascii="Times New Roman" w:hAnsi="Times New Roman" w:cs="Times New Roman"/>
+        </w:rPr>
+        <w:t>lý</w:t>
+      </w:r>
+      <w:proofErr w:type="spellEnd"/>
+      <w:r>
+        <w:rPr>
+          <w:rFonts w:ascii="Times New Roman" w:hAnsi="Times New Roman" w:cs="Times New Roman"/>
+        </w:rPr>
+        <w:t xml:space="preserve"> </w:t>
+      </w:r>
+      <w:proofErr w:type="spellStart"/>
+      <w:r>
+        <w:rPr>
+          <w:rFonts w:ascii="Times New Roman" w:hAnsi="Times New Roman" w:cs="Times New Roman"/>
+        </w:rPr>
+        <w:t>sản</w:t>
+      </w:r>
+      <w:proofErr w:type="spellEnd"/>
+      <w:r>
+        <w:rPr>
+          <w:rFonts w:ascii="Times New Roman" w:hAnsi="Times New Roman" w:cs="Times New Roman"/>
+        </w:rPr>
+        <w:t xml:space="preserve"> </w:t>
+      </w:r>
+      <w:proofErr w:type="spellStart"/>
+      <w:r>
+        <w:rPr>
+          <w:rFonts w:ascii="Times New Roman" w:hAnsi="Times New Roman" w:cs="Times New Roman"/>
+        </w:rPr>
+        <w:t>phẩm</w:t>
+      </w:r>
+      <w:proofErr w:type="spellEnd"/>
+      <w:r>
+        <w:rPr>
+          <w:rFonts w:ascii="Times New Roman" w:hAnsi="Times New Roman" w:cs="Times New Roman"/>
+        </w:rPr>
+        <w:t xml:space="preserve">, </w:t>
+      </w:r>
+      <w:proofErr w:type="spellStart"/>
+      <w:r>
+        <w:rPr>
+          <w:rFonts w:ascii="Times New Roman" w:hAnsi="Times New Roman" w:cs="Times New Roman"/>
+        </w:rPr>
+        <w:t>danh</w:t>
+      </w:r>
+      <w:proofErr w:type="spellEnd"/>
+      <w:r>
+        <w:rPr>
+          <w:rFonts w:ascii="Times New Roman" w:hAnsi="Times New Roman" w:cs="Times New Roman"/>
+        </w:rPr>
+        <w:t xml:space="preserve"> </w:t>
+      </w:r>
+      <w:proofErr w:type="spellStart"/>
+      <w:r>
+        <w:rPr>
+          <w:rFonts w:ascii="Times New Roman" w:hAnsi="Times New Roman" w:cs="Times New Roman"/>
+        </w:rPr>
+        <w:t>mục</w:t>
+      </w:r>
+      <w:proofErr w:type="spellEnd"/>
+      <w:r>
+        <w:rPr>
+          <w:rFonts w:ascii="Times New Roman" w:hAnsi="Times New Roman" w:cs="Times New Roman"/>
+        </w:rPr>
+        <w:t xml:space="preserve">, </w:t>
+      </w:r>
+      <w:proofErr w:type="spellStart"/>
+      <w:r>
+        <w:rPr>
+          <w:rFonts w:ascii="Times New Roman" w:hAnsi="Times New Roman" w:cs="Times New Roman"/>
+        </w:rPr>
+        <w:t>cửa</w:t>
+      </w:r>
+      <w:proofErr w:type="spellEnd"/>
+      <w:r>
+        <w:rPr>
+          <w:rFonts w:ascii="Times New Roman" w:hAnsi="Times New Roman" w:cs="Times New Roman"/>
+        </w:rPr>
+        <w:t xml:space="preserve"> </w:t>
+      </w:r>
+      <w:proofErr w:type="spellStart"/>
+      <w:r>
+        <w:rPr>
+          <w:rFonts w:ascii="Times New Roman" w:hAnsi="Times New Roman" w:cs="Times New Roman"/>
+        </w:rPr>
+        <w:t>hàng</w:t>
+      </w:r>
+      <w:proofErr w:type="spellEnd"/>
+    </w:p>
+    <w:p>
+      <w:pPr>
+        <w:spacing w:line="360" w:lineRule="auto"/>
+        <w:rPr>
+          <w:rFonts w:ascii="Times New Roman" w:hAnsi="Times New Roman" w:cs="Times New Roman"/>
+        </w:rPr>
+      </w:pPr>
+      <w:r>
+        <w:rPr>
+          <w:rFonts w:ascii="Times New Roman" w:hAnsi="Times New Roman" w:cs="Times New Roman"/>
+        </w:rPr>
+        <w:t xml:space="preserve">   - </w:t>
+      </w:r>
+      <w:proofErr w:type="spellStart"/>
+      <w:r>
+        <w:rPr>
+          <w:rFonts w:ascii="Times New Roman" w:hAnsi="Times New Roman" w:cs="Times New Roman"/>
+        </w:rPr>
+        <w:t>Giỏ</w:t>
+      </w:r>
+      <w:proofErr w:type="spellEnd"/>
+      <w:r>
+        <w:rPr>
+          <w:rFonts w:ascii="Times New Roman" w:hAnsi="Times New Roman" w:cs="Times New Roman"/>
+        </w:rPr>
+        <w:t xml:space="preserve"> </w:t>
+      </w:r>
+      <w:proofErr w:type="spellStart"/>
+      <w:r>
+        <w:rPr>
+          <w:rFonts w:ascii="Times New Roman" w:hAnsi="Times New Roman" w:cs="Times New Roman"/>
+        </w:rPr>
+        <w:t>hàng</w:t>
+      </w:r>
+      <w:proofErr w:type="spellEnd"/>
+      <w:r>
+        <w:rPr>
+          <w:rFonts w:ascii="Times New Roman" w:hAnsi="Times New Roman" w:cs="Times New Roman"/>
+        </w:rPr>
+        <w:t xml:space="preserve"> &amp; </w:t>
+      </w:r>
+      <w:proofErr w:type="spellStart"/>
+      <w:r>
+        <w:rPr>
+          <w:rFonts w:ascii="Times New Roman" w:hAnsi="Times New Roman" w:cs="Times New Roman"/>
+        </w:rPr>
+        <w:t>đơn</w:t>
+      </w:r>
+      <w:proofErr w:type="spellEnd"/>
+      <w:r>
+        <w:rPr>
+          <w:rFonts w:ascii="Times New Roman" w:hAnsi="Times New Roman" w:cs="Times New Roman"/>
+        </w:rPr>
+        <w:t xml:space="preserve"> </w:t>
+      </w:r>
+      <w:proofErr w:type="spellStart"/>
+      <w:r>
+        <w:rPr>
+          <w:rFonts w:ascii="Times New Roman" w:hAnsi="Times New Roman" w:cs="Times New Roman"/>
+        </w:rPr>
+        <w:t>hàng</w:t>
+      </w:r>
+      <w:proofErr w:type="spellEnd"/>
+    </w:p>
+    <w:p>
+      <w:pPr>
+        <w:spacing w:line="360" w:lineRule="auto"/>
+        <w:rPr>
+          <w:rFonts w:ascii="Times New Roman" w:hAnsi="Times New Roman" w:cs="Times New Roman"/>
+        </w:rPr>
+      </w:pPr>
+      <w:r>
+        <w:rPr>
+          <w:rFonts w:ascii="Times New Roman" w:hAnsi="Times New Roman" w:cs="Times New Roman"/>
+        </w:rPr>
+        <w:lastRenderedPageBreak/>
+        <w:t xml:space="preserve">   - Thanh </w:t>
+      </w:r>
+      <w:proofErr w:type="spellStart"/>
+      <w:r>
+        <w:rPr>
+          <w:rFonts w:ascii="Times New Roman" w:hAnsi="Times New Roman" w:cs="Times New Roman"/>
+        </w:rPr>
+        <w:t>toán</w:t>
+      </w:r>
+      <w:proofErr w:type="spellEnd"/>
+      <w:r>
+        <w:rPr>
+          <w:rFonts w:ascii="Times New Roman" w:hAnsi="Times New Roman" w:cs="Times New Roman"/>
+        </w:rPr>
+        <w:t xml:space="preserve"> (</w:t>
+      </w:r>
+      <w:proofErr w:type="spellStart"/>
+      <w:r>
+        <w:rPr>
+          <w:rFonts w:ascii="Times New Roman" w:hAnsi="Times New Roman" w:cs="Times New Roman"/>
+        </w:rPr>
+        <w:t>VNPay</w:t>
+      </w:r>
+      <w:proofErr w:type="spellEnd"/>
+      <w:r>
+        <w:rPr>
+          <w:rFonts w:ascii="Times New Roman" w:hAnsi="Times New Roman" w:cs="Times New Roman"/>
+        </w:rPr>
+        <w:t xml:space="preserve"> style) </w:t>
+      </w:r>
+      <w:proofErr w:type="spellStart"/>
+      <w:r>
+        <w:rPr>
+          <w:rFonts w:ascii="Times New Roman" w:hAnsi="Times New Roman" w:cs="Times New Roman"/>
+        </w:rPr>
+        <w:t>với</w:t>
+      </w:r>
+      <w:proofErr w:type="spellEnd"/>
+      <w:r>
+        <w:rPr>
+          <w:rFonts w:ascii="Times New Roman" w:hAnsi="Times New Roman" w:cs="Times New Roman"/>
+        </w:rPr>
+        <w:t xml:space="preserve"> simulate dev</w:t>
+      </w:r>
+    </w:p>
+    <w:p>
+      <w:pPr>
+        <w:spacing w:line="360" w:lineRule="auto"/>
+        <w:rPr>
+          <w:rFonts w:ascii="Times New Roman" w:hAnsi="Times New Roman" w:cs="Times New Roman"/>
+        </w:rPr>
+      </w:pPr>
+      <w:r>
+        <w:rPr>
+          <w:rFonts w:ascii="Times New Roman" w:hAnsi="Times New Roman" w:cs="Times New Roman"/>
+        </w:rPr>
+        <w:t xml:space="preserve">   - Drone delivery: </w:t>
+      </w:r>
+      <w:proofErr w:type="spellStart"/>
+      <w:r>
+        <w:rPr>
+          <w:rFonts w:ascii="Times New Roman" w:hAnsi="Times New Roman" w:cs="Times New Roman"/>
+        </w:rPr>
+        <w:t>tự</w:t>
+      </w:r>
+      <w:proofErr w:type="spellEnd"/>
+      <w:r>
+        <w:rPr>
+          <w:rFonts w:ascii="Times New Roman" w:hAnsi="Times New Roman" w:cs="Times New Roman"/>
+        </w:rPr>
+        <w:t xml:space="preserve"> </w:t>
+      </w:r>
+      <w:proofErr w:type="spellStart"/>
+      <w:r>
+        <w:rPr>
+          <w:rFonts w:ascii="Times New Roman" w:hAnsi="Times New Roman" w:cs="Times New Roman"/>
+        </w:rPr>
+        <w:t>động</w:t>
+      </w:r>
+      <w:proofErr w:type="spellEnd"/>
+      <w:r>
+        <w:rPr>
+          <w:rFonts w:ascii="Times New Roman" w:hAnsi="Times New Roman" w:cs="Times New Roman"/>
+        </w:rPr>
+        <w:t xml:space="preserve"> </w:t>
+      </w:r>
+      <w:proofErr w:type="spellStart"/>
+      <w:r>
+        <w:rPr>
+          <w:rFonts w:ascii="Times New Roman" w:hAnsi="Times New Roman" w:cs="Times New Roman"/>
+        </w:rPr>
+        <w:t>gán</w:t>
+      </w:r>
+      <w:proofErr w:type="spellEnd"/>
+      <w:r>
+        <w:rPr>
+          <w:rFonts w:ascii="Times New Roman" w:hAnsi="Times New Roman" w:cs="Times New Roman"/>
+        </w:rPr>
+        <w:t xml:space="preserve"> drone, </w:t>
+      </w:r>
+      <w:proofErr w:type="spellStart"/>
+      <w:r>
+        <w:rPr>
+          <w:rFonts w:ascii="Times New Roman" w:hAnsi="Times New Roman" w:cs="Times New Roman"/>
+        </w:rPr>
+        <w:t>theo</w:t>
+      </w:r>
+      <w:proofErr w:type="spellEnd"/>
+      <w:r>
+        <w:rPr>
+          <w:rFonts w:ascii="Times New Roman" w:hAnsi="Times New Roman" w:cs="Times New Roman"/>
+        </w:rPr>
+        <w:t xml:space="preserve"> </w:t>
+      </w:r>
+      <w:proofErr w:type="spellStart"/>
+      <w:r>
+        <w:rPr>
+          <w:rFonts w:ascii="Times New Roman" w:hAnsi="Times New Roman" w:cs="Times New Roman"/>
+        </w:rPr>
+        <w:t>dõi</w:t>
+      </w:r>
+      <w:proofErr w:type="spellEnd"/>
+      <w:r>
+        <w:rPr>
+          <w:rFonts w:ascii="Times New Roman" w:hAnsi="Times New Roman" w:cs="Times New Roman"/>
+        </w:rPr>
+        <w:t xml:space="preserve"> </w:t>
+      </w:r>
+      <w:proofErr w:type="spellStart"/>
+      <w:r>
+        <w:rPr>
+          <w:rFonts w:ascii="Times New Roman" w:hAnsi="Times New Roman" w:cs="Times New Roman"/>
+        </w:rPr>
+        <w:t>vị</w:t>
+      </w:r>
+      <w:proofErr w:type="spellEnd"/>
+      <w:r>
+        <w:rPr>
+          <w:rFonts w:ascii="Times New Roman" w:hAnsi="Times New Roman" w:cs="Times New Roman"/>
+        </w:rPr>
+        <w:t xml:space="preserve"> </w:t>
+      </w:r>
+      <w:proofErr w:type="spellStart"/>
+      <w:r>
+        <w:rPr>
+          <w:rFonts w:ascii="Times New Roman" w:hAnsi="Times New Roman" w:cs="Times New Roman"/>
+        </w:rPr>
+        <w:t>trí</w:t>
+      </w:r>
+      <w:proofErr w:type="spellEnd"/>
+    </w:p>
+    <w:p>
+      <w:pPr>
+        <w:spacing w:line="360" w:lineRule="auto"/>
+        <w:rPr>
+          <w:rFonts w:ascii="Times New Roman" w:hAnsi="Times New Roman" w:cs="Times New Roman"/>
+        </w:rPr>
+      </w:pPr>
+      <w:r>
+        <w:rPr>
+          <w:rFonts w:ascii="Times New Roman" w:hAnsi="Times New Roman" w:cs="Times New Roman"/>
+        </w:rPr>
+        <w:t xml:space="preserve">   - Quản </w:t>
+      </w:r>
+      <w:proofErr w:type="spellStart"/>
+      <w:r>
+        <w:rPr>
+          <w:rFonts w:ascii="Times New Roman" w:hAnsi="Times New Roman" w:cs="Times New Roman"/>
+        </w:rPr>
+        <w:t>lý</w:t>
+      </w:r>
+      <w:proofErr w:type="spellEnd"/>
+      <w:r>
+        <w:rPr>
+          <w:rFonts w:ascii="Times New Roman" w:hAnsi="Times New Roman" w:cs="Times New Roman"/>
+        </w:rPr>
+        <w:t xml:space="preserve"> </w:t>
+      </w:r>
+      <w:proofErr w:type="spellStart"/>
+      <w:r>
+        <w:rPr>
+          <w:rFonts w:ascii="Times New Roman" w:hAnsi="Times New Roman" w:cs="Times New Roman"/>
+        </w:rPr>
+        <w:t>người</w:t>
+      </w:r>
+      <w:proofErr w:type="spellEnd"/>
+      <w:r>
+        <w:rPr>
+          <w:rFonts w:ascii="Times New Roman" w:hAnsi="Times New Roman" w:cs="Times New Roman"/>
+        </w:rPr>
+        <w:t xml:space="preserve"> </w:t>
+      </w:r>
+      <w:proofErr w:type="spellStart"/>
+      <w:r>
+        <w:rPr>
+          <w:rFonts w:ascii="Times New Roman" w:hAnsi="Times New Roman" w:cs="Times New Roman"/>
+        </w:rPr>
+        <w:t>dùng</w:t>
+      </w:r>
+      <w:proofErr w:type="spellEnd"/>
+      <w:r>
+        <w:rPr>
+          <w:rFonts w:ascii="Times New Roman" w:hAnsi="Times New Roman" w:cs="Times New Roman"/>
+        </w:rPr>
+        <w:t xml:space="preserve"> &amp; </w:t>
+      </w:r>
+      <w:proofErr w:type="spellStart"/>
+      <w:r>
+        <w:rPr>
+          <w:rFonts w:ascii="Times New Roman" w:hAnsi="Times New Roman" w:cs="Times New Roman"/>
+        </w:rPr>
+        <w:t>địa</w:t>
+      </w:r>
+      <w:proofErr w:type="spellEnd"/>
+      <w:r>
+        <w:rPr>
+          <w:rFonts w:ascii="Times New Roman" w:hAnsi="Times New Roman" w:cs="Times New Roman"/>
+        </w:rPr>
+        <w:t xml:space="preserve"> </w:t>
+      </w:r>
+      <w:proofErr w:type="spellStart"/>
+      <w:r>
+        <w:rPr>
+          <w:rFonts w:ascii="Times New Roman" w:hAnsi="Times New Roman" w:cs="Times New Roman"/>
+        </w:rPr>
+        <w:t>chỉ</w:t>
+      </w:r>
+      <w:proofErr w:type="spellEnd"/>
+    </w:p>
+    <w:p>
+      <w:pPr>
+        <w:spacing w:line="360" w:lineRule="auto"/>
+        <w:rPr>
+          <w:rFonts w:ascii="Times New Roman" w:hAnsi="Times New Roman" w:cs="Times New Roman"/>
+        </w:rPr>
+      </w:pPr>
+      <w:proofErr w:type="spellStart"/>
+      <w:r>
+        <w:rPr>
+          <w:rFonts w:ascii="Times New Roman" w:hAnsi="Times New Roman" w:cs="Times New Roman"/>
+        </w:rPr>
+        <w:t>Thiết</w:t>
+      </w:r>
+      <w:proofErr w:type="spellEnd"/>
+      <w:r>
+        <w:rPr>
+          <w:rFonts w:ascii="Times New Roman" w:hAnsi="Times New Roman" w:cs="Times New Roman"/>
+        </w:rPr>
+        <w:t xml:space="preserve"> </w:t>
+      </w:r>
+      <w:proofErr w:type="spellStart"/>
+      <w:r>
+        <w:rPr>
+          <w:rFonts w:ascii="Times New Roman" w:hAnsi="Times New Roman" w:cs="Times New Roman"/>
+        </w:rPr>
+        <w:t>kế</w:t>
+      </w:r>
+      <w:proofErr w:type="spellEnd"/>
+      <w:r>
+        <w:rPr>
+          <w:rFonts w:ascii="Times New Roman" w:hAnsi="Times New Roman" w:cs="Times New Roman"/>
+        </w:rPr>
+        <w:t xml:space="preserve"> </w:t>
+      </w:r>
+      <w:proofErr w:type="spellStart"/>
+      <w:r>
+        <w:rPr>
+          <w:rFonts w:ascii="Times New Roman" w:hAnsi="Times New Roman" w:cs="Times New Roman"/>
+        </w:rPr>
+        <w:t>chính</w:t>
+      </w:r>
+      <w:proofErr w:type="spellEnd"/>
+      <w:r>
+        <w:rPr>
+          <w:rFonts w:ascii="Times New Roman" w:hAnsi="Times New Roman" w:cs="Times New Roman"/>
+        </w:rPr>
+        <w:t>:</w:t>
+      </w:r>
+    </w:p>
+    <w:p>
+      <w:pPr>
+        <w:spacing w:line="360" w:lineRule="auto"/>
+        <w:rPr>
+          <w:rFonts w:ascii="Times New Roman" w:hAnsi="Times New Roman" w:cs="Times New Roman"/>
+        </w:rPr>
+      </w:pPr>
+      <w:r>
+        <w:rPr>
+          <w:rFonts w:ascii="Times New Roman" w:hAnsi="Times New Roman" w:cs="Times New Roman"/>
+        </w:rPr>
+        <w:t xml:space="preserve">  - Layered architecture: Controller -&gt; Service -&gt; Repository -&gt; Entity</w:t>
+      </w:r>
+    </w:p>
+    <w:p>
+      <w:pPr>
+        <w:spacing w:line="360" w:lineRule="auto"/>
+        <w:rPr>
+          <w:rFonts w:ascii="Times New Roman" w:hAnsi="Times New Roman" w:cs="Times New Roman"/>
+        </w:rPr>
+      </w:pPr>
+      <w:r>
+        <w:rPr>
+          <w:rFonts w:ascii="Times New Roman" w:hAnsi="Times New Roman" w:cs="Times New Roman"/>
+        </w:rPr>
+        <w:t xml:space="preserve">  - </w:t>
+      </w:r>
+      <w:proofErr w:type="spellStart"/>
+      <w:r>
+        <w:rPr>
+          <w:rFonts w:ascii="Times New Roman" w:hAnsi="Times New Roman" w:cs="Times New Roman"/>
+        </w:rPr>
+        <w:t>Dùng</w:t>
+      </w:r>
+      <w:proofErr w:type="spellEnd"/>
+      <w:r>
+        <w:rPr>
+          <w:rFonts w:ascii="Times New Roman" w:hAnsi="Times New Roman" w:cs="Times New Roman"/>
+        </w:rPr>
+        <w:t xml:space="preserve"> DTO request/response, </w:t>
+      </w:r>
+      <w:proofErr w:type="spellStart"/>
+      <w:r>
+        <w:rPr>
+          <w:rFonts w:ascii="Times New Roman" w:hAnsi="Times New Roman" w:cs="Times New Roman"/>
+        </w:rPr>
+        <w:t>MapStruct</w:t>
+      </w:r>
+      <w:proofErr w:type="spellEnd"/>
+      <w:r>
+        <w:rPr>
+          <w:rFonts w:ascii="Times New Roman" w:hAnsi="Times New Roman" w:cs="Times New Roman"/>
+        </w:rPr>
+        <w:t xml:space="preserve"> Mapper</w:t>
+      </w:r>
+    </w:p>
+    <w:p>
+      <w:pPr>
+        <w:spacing w:line="360" w:lineRule="auto"/>
+        <w:rPr>
+          <w:rFonts w:ascii="Times New Roman" w:hAnsi="Times New Roman" w:cs="Times New Roman"/>
+        </w:rPr>
+      </w:pPr>
+      <w:r>
+        <w:rPr>
+          <w:rFonts w:ascii="Times New Roman" w:hAnsi="Times New Roman" w:cs="Times New Roman"/>
+        </w:rPr>
+        <w:t xml:space="preserve">  - Exception </w:t>
+      </w:r>
+      <w:proofErr w:type="spellStart"/>
+      <w:r>
+        <w:rPr>
+          <w:rFonts w:ascii="Times New Roman" w:hAnsi="Times New Roman" w:cs="Times New Roman"/>
+        </w:rPr>
+        <w:t>tập</w:t>
+      </w:r>
+      <w:proofErr w:type="spellEnd"/>
+      <w:r>
+        <w:rPr>
+          <w:rFonts w:ascii="Times New Roman" w:hAnsi="Times New Roman" w:cs="Times New Roman"/>
+        </w:rPr>
+        <w:t xml:space="preserve"> </w:t>
+      </w:r>
+      <w:proofErr w:type="spellStart"/>
+      <w:r>
+        <w:rPr>
+          <w:rFonts w:ascii="Times New Roman" w:hAnsi="Times New Roman" w:cs="Times New Roman"/>
+        </w:rPr>
+        <w:t>trung</w:t>
+      </w:r>
+      <w:proofErr w:type="spellEnd"/>
+      <w:r>
+        <w:rPr>
+          <w:rFonts w:ascii="Times New Roman" w:hAnsi="Times New Roman" w:cs="Times New Roman"/>
+        </w:rPr>
+        <w:t xml:space="preserve"> </w:t>
+      </w:r>
+      <w:proofErr w:type="spellStart"/>
+      <w:r>
+        <w:rPr>
+          <w:rFonts w:ascii="Times New Roman" w:hAnsi="Times New Roman" w:cs="Times New Roman"/>
+        </w:rPr>
+        <w:t>với</w:t>
+      </w:r>
+      <w:proofErr w:type="spellEnd"/>
+      <w:r>
+        <w:rPr>
+          <w:rFonts w:ascii="Times New Roman" w:hAnsi="Times New Roman" w:cs="Times New Roman"/>
+        </w:rPr>
+        <w:t xml:space="preserve"> </w:t>
+      </w:r>
+      <w:proofErr w:type="spellStart"/>
+      <w:r>
+        <w:rPr>
+          <w:rFonts w:ascii="Times New Roman" w:hAnsi="Times New Roman" w:cs="Times New Roman"/>
+        </w:rPr>
+        <w:t>AppException</w:t>
+      </w:r>
+      <w:proofErr w:type="spellEnd"/>
+      <w:r>
+        <w:rPr>
+          <w:rFonts w:ascii="Times New Roman" w:hAnsi="Times New Roman" w:cs="Times New Roman"/>
+        </w:rPr>
+        <w:t xml:space="preserve"> &amp; </w:t>
+      </w:r>
+      <w:proofErr w:type="spellStart"/>
+      <w:r>
+        <w:rPr>
+          <w:rFonts w:ascii="Times New Roman" w:hAnsi="Times New Roman" w:cs="Times New Roman"/>
+        </w:rPr>
+        <w:t>ErrorCode</w:t>
+      </w:r>
+      <w:proofErr w:type="spellEnd"/>
+    </w:p>
+    <w:p>
+      <w:pPr>
+        <w:spacing w:line="360" w:lineRule="auto"/>
+        <w:rPr>
+          <w:rFonts w:ascii="Times New Roman" w:hAnsi="Times New Roman" w:cs="Times New Roman"/>
+        </w:rPr>
+      </w:pPr>
+      <w:r>
+        <w:rPr>
+          <w:rFonts w:ascii="Times New Roman" w:hAnsi="Times New Roman" w:cs="Times New Roman"/>
+        </w:rPr>
+        <w:t xml:space="preserve">  - Payment flow: </w:t>
+      </w:r>
+      <w:proofErr w:type="spellStart"/>
+      <w:r>
+        <w:rPr>
+          <w:rFonts w:ascii="Times New Roman" w:hAnsi="Times New Roman" w:cs="Times New Roman"/>
+        </w:rPr>
+        <w:t>tạo</w:t>
+      </w:r>
+      <w:proofErr w:type="spellEnd"/>
+      <w:r>
+        <w:rPr>
+          <w:rFonts w:ascii="Times New Roman" w:hAnsi="Times New Roman" w:cs="Times New Roman"/>
+        </w:rPr>
+        <w:t xml:space="preserve"> transaction PENDING, </w:t>
+      </w:r>
+      <w:proofErr w:type="spellStart"/>
+      <w:r>
+        <w:rPr>
+          <w:rFonts w:ascii="Times New Roman" w:hAnsi="Times New Roman" w:cs="Times New Roman"/>
+        </w:rPr>
+        <w:t>xác</w:t>
+      </w:r>
+      <w:proofErr w:type="spellEnd"/>
+      <w:r>
+        <w:rPr>
+          <w:rFonts w:ascii="Times New Roman" w:hAnsi="Times New Roman" w:cs="Times New Roman"/>
+        </w:rPr>
+        <w:t xml:space="preserve"> </w:t>
+      </w:r>
+      <w:proofErr w:type="spellStart"/>
+      <w:r>
+        <w:rPr>
+          <w:rFonts w:ascii="Times New Roman" w:hAnsi="Times New Roman" w:cs="Times New Roman"/>
+        </w:rPr>
+        <w:t>thực</w:t>
+      </w:r>
+      <w:proofErr w:type="spellEnd"/>
+      <w:r>
+        <w:rPr>
+          <w:rFonts w:ascii="Times New Roman" w:hAnsi="Times New Roman" w:cs="Times New Roman"/>
+        </w:rPr>
+        <w:t xml:space="preserve"> callback, </w:t>
+      </w:r>
+      <w:proofErr w:type="spellStart"/>
+      <w:r>
+        <w:rPr>
+          <w:rFonts w:ascii="Times New Roman" w:hAnsi="Times New Roman" w:cs="Times New Roman"/>
+        </w:rPr>
+        <w:t>chuyển</w:t>
+      </w:r>
+      <w:proofErr w:type="spellEnd"/>
+      <w:r>
+        <w:rPr>
+          <w:rFonts w:ascii="Times New Roman" w:hAnsi="Times New Roman" w:cs="Times New Roman"/>
+        </w:rPr>
+        <w:t xml:space="preserve"> SUCCESS</w:t>
+      </w:r>
+    </w:p>
+    <w:p>
+      <w:pPr>
+        <w:spacing w:line="360" w:lineRule="auto"/>
+        <w:rPr>
+          <w:rFonts w:ascii="Times New Roman" w:hAnsi="Times New Roman" w:cs="Times New Roman"/>
+        </w:rPr>
+      </w:pPr>
+      <w:r>
+        <w:rPr>
+          <w:rFonts w:ascii="Times New Roman" w:hAnsi="Times New Roman" w:cs="Times New Roman"/>
+        </w:rPr>
+        <w:t xml:space="preserve">  - Delivery flow: </w:t>
+      </w:r>
+      <w:proofErr w:type="spellStart"/>
+      <w:r>
+        <w:rPr>
+          <w:rFonts w:ascii="Times New Roman" w:hAnsi="Times New Roman" w:cs="Times New Roman"/>
+        </w:rPr>
+        <w:t>có</w:t>
+      </w:r>
+      <w:proofErr w:type="spellEnd"/>
+      <w:r>
+        <w:rPr>
+          <w:rFonts w:ascii="Times New Roman" w:hAnsi="Times New Roman" w:cs="Times New Roman"/>
+        </w:rPr>
+        <w:t xml:space="preserve"> thread/logic auto progression </w:t>
+      </w:r>
+      <w:proofErr w:type="spellStart"/>
+      <w:r>
+        <w:rPr>
+          <w:rFonts w:ascii="Times New Roman" w:hAnsi="Times New Roman" w:cs="Times New Roman"/>
+        </w:rPr>
+        <w:t>trạng</w:t>
+      </w:r>
+      <w:proofErr w:type="spellEnd"/>
+      <w:r>
+        <w:rPr>
+          <w:rFonts w:ascii="Times New Roman" w:hAnsi="Times New Roman" w:cs="Times New Roman"/>
+        </w:rPr>
+        <w:t xml:space="preserve"> </w:t>
+      </w:r>
+      <w:proofErr w:type="spellStart"/>
+      <w:r>
+        <w:rPr>
+          <w:rFonts w:ascii="Times New Roman" w:hAnsi="Times New Roman" w:cs="Times New Roman"/>
+        </w:rPr>
+        <w:t>thái</w:t>
+      </w:r>
+      <w:proofErr w:type="spellEnd"/>
+      <w:r>
+        <w:rPr>
+          <w:rFonts w:ascii="Times New Roman" w:hAnsi="Times New Roman" w:cs="Times New Roman"/>
+        </w:rPr>
+        <w:t xml:space="preserve"> LAUNCHED -&gt; ARRIVING -&gt; COMPLETED</w:t>
+      </w:r>
+    </w:p>
+    <w:p>
+      <w:pPr>
+        <w:spacing w:line="360" w:lineRule="auto"/>
+        <w:rPr>
+          <w:rFonts w:ascii="Times New Roman" w:hAnsi="Times New Roman" w:cs="Times New Roman"/>
+        </w:rPr>
+      </w:pPr>
+      <w:r>
+        <w:rPr>
+          <w:rFonts w:ascii="Times New Roman" w:hAnsi="Times New Roman" w:cs="Times New Roman"/>
+        </w:rPr>
+        <w:t xml:space="preserve">  - </w:t>
+      </w:r>
+      <w:proofErr w:type="spellStart"/>
+      <w:r>
+        <w:rPr>
+          <w:rFonts w:ascii="Times New Roman" w:hAnsi="Times New Roman" w:cs="Times New Roman"/>
+        </w:rPr>
+        <w:t>Không</w:t>
+      </w:r>
+      <w:proofErr w:type="spellEnd"/>
+      <w:r>
+        <w:rPr>
+          <w:rFonts w:ascii="Times New Roman" w:hAnsi="Times New Roman" w:cs="Times New Roman"/>
+        </w:rPr>
+        <w:t xml:space="preserve"> auto cancel </w:t>
+      </w:r>
+      <w:proofErr w:type="spellStart"/>
+      <w:r>
+        <w:rPr>
+          <w:rFonts w:ascii="Times New Roman" w:hAnsi="Times New Roman" w:cs="Times New Roman"/>
+        </w:rPr>
+        <w:t>đơn</w:t>
+      </w:r>
+      <w:proofErr w:type="spellEnd"/>
+      <w:r>
+        <w:rPr>
+          <w:rFonts w:ascii="Times New Roman" w:hAnsi="Times New Roman" w:cs="Times New Roman"/>
+        </w:rPr>
+        <w:t xml:space="preserve"> PAID </w:t>
+      </w:r>
+      <w:proofErr w:type="spellStart"/>
+      <w:r>
+        <w:rPr>
+          <w:rFonts w:ascii="Times New Roman" w:hAnsi="Times New Roman" w:cs="Times New Roman"/>
+        </w:rPr>
+        <w:t>khi</w:t>
+      </w:r>
+      <w:proofErr w:type="spellEnd"/>
+      <w:r>
+        <w:rPr>
+          <w:rFonts w:ascii="Times New Roman" w:hAnsi="Times New Roman" w:cs="Times New Roman"/>
+        </w:rPr>
+        <w:t xml:space="preserve"> </w:t>
+      </w:r>
+      <w:proofErr w:type="spellStart"/>
+      <w:r>
+        <w:rPr>
+          <w:rFonts w:ascii="Times New Roman" w:hAnsi="Times New Roman" w:cs="Times New Roman"/>
+        </w:rPr>
+        <w:t>giao</w:t>
+      </w:r>
+      <w:proofErr w:type="spellEnd"/>
+      <w:r>
+        <w:rPr>
+          <w:rFonts w:ascii="Times New Roman" w:hAnsi="Times New Roman" w:cs="Times New Roman"/>
+        </w:rPr>
+        <w:t xml:space="preserve"> </w:t>
+      </w:r>
+      <w:proofErr w:type="spellStart"/>
+      <w:r>
+        <w:rPr>
+          <w:rFonts w:ascii="Times New Roman" w:hAnsi="Times New Roman" w:cs="Times New Roman"/>
+        </w:rPr>
+        <w:t>hàng</w:t>
+      </w:r>
+      <w:proofErr w:type="spellEnd"/>
+      <w:r>
+        <w:rPr>
+          <w:rFonts w:ascii="Times New Roman" w:hAnsi="Times New Roman" w:cs="Times New Roman"/>
+        </w:rPr>
+        <w:t xml:space="preserve"> FAILED</w:t>
+      </w:r>
+    </w:p>
+    <w:p>
+      <w:pPr>
+        <w:spacing w:line="360" w:lineRule="auto"/>
+        <w:rPr>
+          <w:rFonts w:ascii="Times New Roman" w:hAnsi="Times New Roman" w:cs="Times New Roman"/>
+        </w:rPr>
+      </w:pPr>
+      <w:r>
+        <w:rPr>
+          <w:rFonts w:ascii="Times New Roman" w:hAnsi="Times New Roman" w:cs="Times New Roman"/>
+        </w:rPr>
+        <w:t xml:space="preserve">Bảo </w:t>
+      </w:r>
+      <w:proofErr w:type="spellStart"/>
+      <w:r>
+        <w:rPr>
+          <w:rFonts w:ascii="Times New Roman" w:hAnsi="Times New Roman" w:cs="Times New Roman"/>
+        </w:rPr>
+        <w:t>mật</w:t>
+      </w:r>
+      <w:proofErr w:type="spellEnd"/>
+      <w:r>
+        <w:rPr>
+          <w:rFonts w:ascii="Times New Roman" w:hAnsi="Times New Roman" w:cs="Times New Roman"/>
+        </w:rPr>
+        <w:t>:</w:t>
+      </w:r>
+    </w:p>
+    <w:p>
+      <w:pPr>
+        <w:spacing w:line="360" w:lineRule="auto"/>
+        <w:rPr>
+          <w:rFonts w:ascii="Times New Roman" w:hAnsi="Times New Roman" w:cs="Times New Roman"/>
+        </w:rPr>
+      </w:pPr>
+      <w:r>
+        <w:rPr>
+          <w:rFonts w:ascii="Times New Roman" w:hAnsi="Times New Roman" w:cs="Times New Roman"/>
+        </w:rPr>
+        <w:t xml:space="preserve">  - JWT Bearer </w:t>
+      </w:r>
+      <w:proofErr w:type="spellStart"/>
+      <w:r>
+        <w:rPr>
+          <w:rFonts w:ascii="Times New Roman" w:hAnsi="Times New Roman" w:cs="Times New Roman"/>
+        </w:rPr>
+        <w:t>trong</w:t>
+      </w:r>
+      <w:proofErr w:type="spellEnd"/>
+      <w:r>
+        <w:rPr>
+          <w:rFonts w:ascii="Times New Roman" w:hAnsi="Times New Roman" w:cs="Times New Roman"/>
+        </w:rPr>
+        <w:t xml:space="preserve"> header Authorization</w:t>
+      </w:r>
+    </w:p>
+    <w:p>
+      <w:pPr>
+        <w:spacing w:line="360" w:lineRule="auto"/>
+        <w:rPr>
+          <w:rFonts w:ascii="Times New Roman" w:hAnsi="Times New Roman" w:cs="Times New Roman"/>
+        </w:rPr>
+      </w:pPr>
+      <w:r>
+        <w:rPr>
+          <w:rFonts w:ascii="Times New Roman" w:hAnsi="Times New Roman" w:cs="Times New Roman"/>
+        </w:rPr>
+        <w:t xml:space="preserve">  - Role-based (USER, STORE_OWNER, ADMIN)</w:t>
+      </w:r>
+    </w:p>
+    <w:p>
+      <w:pPr>
+        <w:spacing w:line="360" w:lineRule="auto"/>
+        <w:rPr>
+          <w:rFonts w:ascii="Times New Roman" w:hAnsi="Times New Roman" w:cs="Times New Roman"/>
+          <w:b/>
+          <w:bCs/>
+          <w:sz w:val="28"/>
+          <w:szCs w:val="28"/>
+        </w:rPr>
+      </w:pPr>
+      <w:r>
+        <w:rPr>
+          <w:rFonts w:ascii="Times New Roman" w:hAnsi="Times New Roman" w:cs="Times New Roman"/>
+          <w:b/>
+          <w:bCs/>
+          <w:sz w:val="28"/>
+          <w:szCs w:val="28"/>
+        </w:rPr>
+        <w:t>ERD</w:t>
+      </w:r>
+    </w:p>
+    <w:p>
+      <w:pPr>
+        <w:spacing w:line="360" w:lineRule="auto"/>
+        <w:rPr>
+          <w:rFonts w:ascii="Times New Roman" w:hAnsi="Times New Roman" w:cs="Times New Roman"/>
+          <w:b/>
+          <w:bCs/>
+          <w:sz w:val="28"/>
+          <w:szCs w:val="28"/>
+        </w:rPr>
+      </w:pPr>
+      <w:r>
+        <w:rPr>
+          <w:rFonts w:ascii="Times New Roman" w:hAnsi="Times New Roman" w:cs="Times New Roman"/>
+          <w:b/>
+          <w:bCs/>
+          <w:sz w:val="28"/>
+          <w:szCs w:val="28"/>
+        </w:rPr>
+        <w:drawing>
+          <wp:inline distT="0" distB="0" distL="0" distR="0" wp14:anchorId="17B65897" wp14:editId="073AC104">
+            <wp:extent cx="5629565" cy="2788920"/>
+            <wp:effectExtent l="0" t="0" r="9525" b="0"/>
+            <wp:docPr id="961430425" name="Picture 19" descr="A diagram of a product&#10;&#10;AI-generated content may be incorrect."/>
+            <wp:cNvGraphicFramePr>
+              <a:graphicFrameLocks xmlns:a="http://schemas.openxmlformats.org/drawingml/2006/main" noChangeAspect="1"/>
+            </wp:cNvGraphicFramePr>
+            <a:graphic xmlns:a="http://schemas.openxmlformats.org/drawingml/2006/main">
+              <a:graphicData uri="http://schemas.openxmlformats.org/drawingml/2006/picture">
+                <pic:pic xmlns:pic="http://schemas.openxmlformats.org/drawingml/2006/picture">
+                  <pic:nvPicPr>
+                    <pic:cNvPr id="961430425" name="Picture 19" descr="A diagram of a product&#10;&#10;AI-generated content may be incorrect."/>
+                    <pic:cNvPicPr>
+                      <a:picLocks noChangeAspect="1" noChangeArrowheads="1"/>
+                    </pic:cNvPicPr>
+                  </pic:nvPicPr>
+                  <pic:blipFill>
+                    <a:blip r:embed="rId15" cstate="print">
+                      <a:extLst>
+                        <a:ext uri="{28A0092B-C50C-407E-A947-70E740481C1C}">
+                          <a14:useLocalDpi xmlns:a14="http://schemas.microsoft.com/office/drawing/2010/main" val="0"/>
+                        </a:ext>
+                      </a:extLst>
+                    </a:blip>
+                    <a:srcRect/>
+                    <a:stretch>
+                      <a:fillRect/>
+                    </a:stretch>
+                  </pic:blipFill>
+                  <pic:spPr bwMode="auto">
+                    <a:xfrm>
+                      <a:off x="0" y="0"/>
+                      <a:ext cx="5640776" cy="2794474"/>
+                    </a:xfrm>
+                    <a:prstGeom prst="rect">
+                      <a:avLst/>
+                    </a:prstGeom>
+                    <a:noFill/>
+                    <a:ln>
+                      <a:noFill/>
+                    </a:ln>
+                  </pic:spPr>
+                </pic:pic>
+              </a:graphicData>
+            </a:graphic>
+          </wp:inline>
+        </w:drawing>
+      </w:r>
     </w:p>
     <w:sectPr>
       <w:pgSz w:w="12240" w:h="15840"/>
@@ -11830,7 +13958,7 @@
         <w:rFonts w:ascii="Times New Roman" w:eastAsiaTheme="minorHAnsi" w:hAnsi="Times New Roman" w:cs="Times New Roman" w:hint="default"/>
       </w:rPr>
     </w:lvl>
-    <w:lvl w:ilvl="1" w:tplc="04090003" w:tentative="1">
+    <w:lvl w:ilvl="1" w:tplc="04090003">
       <w:start w:val="1"/>
       <w:numFmt w:val="bullet"/>
       <w:lvlText w:val="o"/>
@@ -13312,6 +15440,7 @@
   <w:style w:type="paragraph" w:default="1" w:styleId="Normal">
     <w:name w:val="Normal"/>
     <w:qFormat/>
+    <w:rsid w:val="00D03B78"/>
   </w:style>
   <w:style w:type="paragraph" w:styleId="Heading1">
     <w:name w:val="heading 1"/>
@@ -13515,7 +15644,6 @@
   <w:style w:type="character" w:default="1" w:styleId="DefaultParagraphFont">
     <w:name w:val="Default Paragraph Font"/>
     <w:uiPriority w:val="1"/>
-    <w:semiHidden/>
     <w:unhideWhenUsed/>
   </w:style>
   <w:style w:type="table" w:default="1" w:styleId="TableNormal">

</xml_diff>